<commit_message>
Expand clinical templates to all paramedical professions + fix Word RTL
- Added profession field to ClinicalTemplate type
- Added 8 new templates: SLP adult/pediatric, OT adult/pediatric,
  dietetics, community nursing, clinical psychology, chiropractic
- Updated all 7 physiotherapy templates with profession field
- TemplateClient now groups templates by profession
- buildSoapPrompt updated to be profession-agnostic
- praxisai-spec.py: adds w:rtl and w:lang bidi to runs, w:bidiVisual to tables
- Updated spec content to reflect 15 templates and all professions
- Regenerated praxisai-spec.docx with RTL support

https://claude.ai/code/session_01NpYbLQsrRr1gakFF6yW1K8
</commit_message>
<xml_diff>
--- a/praxisai-spec.docx
+++ b/praxisai-spec.docx
@@ -24,6 +24,8 @@
         <w:rPr>
           <w:color w:val="475569"/>
           <w:sz w:val="32"/>
+          <w:rtl/>
+          <w:lang w:bidi="he-IL"/>
         </w:rPr>
         <w:t>מסמך אפיון מערכת — גרסה 1.0</w:t>
       </w:r>
@@ -37,8 +39,10 @@
         <w:rPr>
           <w:color w:val="64748B"/>
           <w:sz w:val="26"/>
+          <w:rtl/>
+          <w:lang w:bidi="he-IL"/>
         </w:rPr>
-        <w:t>פלטפורמת תיעוד קליני מבוססת בינה מלאכותית לפיזיותרפיה בישראל</w:t>
+        <w:t>פלטפורמת תיעוד קליני מבוססת בינה מלאכותית לאנשי מקצוע פרא-רפואיים בישראל</w:t>
       </w:r>
     </w:p>
     <w:p>
@@ -50,6 +54,8 @@
         <w:rPr>
           <w:color w:val="94A3B8"/>
           <w:sz w:val="22"/>
+          <w:rtl/>
+          <w:lang w:bidi="he-IL"/>
         </w:rPr>
         <w:t>יוני 2026</w:t>
       </w:r>
@@ -66,6 +72,10 @@
         <w:jc w:val="right"/>
       </w:pPr>
       <w:r>
+        <w:rPr>
+          <w:rtl/>
+          <w:lang w:bidi="he-IL"/>
+        </w:rPr>
         <w:t>1. מבוא ומטרות</w:t>
       </w:r>
     </w:p>
@@ -79,8 +89,10 @@
         <w:rPr>
           <w:b w:val="0"/>
           <w:sz w:val="22"/>
+          <w:rtl/>
+          <w:lang w:bidi="he-IL"/>
         </w:rPr>
-        <w:t>praxisAI היא פלטפורמת תיעוד קליני מבוססת בינה מלאכותית, המיועדת לקליניקות פיזיותרפיה בישראל. המטרה: לאפשר לפיזיותרפיסט להתמקד בטיפול — בעוד ה-AI מטפל בתיעוד.</w:t>
+        <w:t>praxisAI היא פלטפורמת תיעוד קליני מבוססת בינה מלאכותית, המיועדת לקליניקות פרא-רפואיות בישראל: פיזיותרפיה, קלינאות תקשורת, ריפוי בעיסוק, תזונה קלינית, סיעוד, פסיכולוגיה קלינית וכירופרקטיקה. המטרה: לאפשר למטפל להתמקד בטיפול — בעוד ה-AI מטפל בתיעוד.</w:t>
       </w:r>
     </w:p>
     <w:p>
@@ -90,6 +102,10 @@
         <w:jc w:val="right"/>
       </w:pPr>
       <w:r>
+        <w:rPr>
+          <w:rtl/>
+          <w:lang w:bidi="he-IL"/>
+        </w:rPr>
         <w:t>1.1 הבעיה שאנחנו פותרים</w:t>
       </w:r>
     </w:p>
@@ -103,8 +119,10 @@
       <w:r>
         <w:rPr>
           <w:sz w:val="22"/>
+          <w:rtl/>
+          <w:lang w:bidi="he-IL"/>
         </w:rPr>
-        <w:t>פיזיותרפיסטים מבזבזים 20–40% מזמנם על תיעוד מינהלי</w:t>
+        <w:t>אנשי מקצוע פרא-רפואיים מבזבזים 20–40% מזמנם על תיעוד מינהלי</w:t>
       </w:r>
     </w:p>
     <w:p>
@@ -117,6 +135,8 @@
       <w:r>
         <w:rPr>
           <w:sz w:val="22"/>
+          <w:rtl/>
+          <w:lang w:bidi="he-IL"/>
         </w:rPr>
         <w:t>רשומות ידניות איכותיות דורשות 10–20 דקות לטיפול</w:t>
       </w:r>
@@ -131,6 +151,8 @@
       <w:r>
         <w:rPr>
           <w:sz w:val="22"/>
+          <w:rtl/>
+          <w:lang w:bidi="he-IL"/>
         </w:rPr>
         <w:t>שגיאות ושכחה בתיעוד בדיעבד</w:t>
       </w:r>
@@ -145,6 +167,8 @@
       <w:r>
         <w:rPr>
           <w:sz w:val="22"/>
+          <w:rtl/>
+          <w:lang w:bidi="he-IL"/>
         </w:rPr>
         <w:t>מסמכים לביטוח לאומי, הפניות ודו"חות — עבודה ידנית נוספת</w:t>
       </w:r>
@@ -156,6 +180,10 @@
         <w:jc w:val="right"/>
       </w:pPr>
       <w:r>
+        <w:rPr>
+          <w:rtl/>
+          <w:lang w:bidi="he-IL"/>
+        </w:rPr>
         <w:t>1.2 הפתרון</w:t>
       </w:r>
     </w:p>
@@ -169,6 +197,8 @@
         <w:rPr>
           <w:b w:val="0"/>
           <w:sz w:val="22"/>
+          <w:rtl/>
+          <w:lang w:bidi="he-IL"/>
         </w:rPr>
         <w:t>הקלט → תמלול בעברית ב-AI → רשומה קלינית מובנית → מסמכים אוטומטיים</w:t>
       </w:r>
@@ -183,6 +213,8 @@
         <w:rPr>
           <w:b w:val="0"/>
           <w:sz w:val="22"/>
+          <w:rtl/>
+          <w:lang w:bidi="he-IL"/>
         </w:rPr>
         <w:t>שחרור 5–10 שעות עבודה ידנית בשבוע לכל מטפל.</w:t>
       </w:r>
@@ -206,6 +238,10 @@
         <w:jc w:val="right"/>
       </w:pPr>
       <w:r>
+        <w:rPr>
+          <w:rtl/>
+          <w:lang w:bidi="he-IL"/>
+        </w:rPr>
         <w:t>2. קהל יעד</w:t>
       </w:r>
     </w:p>
@@ -216,6 +252,10 @@
         <w:jc w:val="right"/>
       </w:pPr>
       <w:r>
+        <w:rPr>
+          <w:rtl/>
+          <w:lang w:bidi="he-IL"/>
+        </w:rPr>
         <w:t>2.1 משתמשים עיקריים</w:t>
       </w:r>
     </w:p>
@@ -229,8 +269,10 @@
       <w:r>
         <w:rPr>
           <w:sz w:val="22"/>
+          <w:rtl/>
+          <w:lang w:bidi="he-IL"/>
         </w:rPr>
-        <w:t>פיזיותרפיסטים קליניים — מטפלים המשתמשים ב-Scribe ובתיעוד</w:t>
+        <w:t>אנשי מקצוע פרא-רפואיים — מטפלים המשתמשים ב-Scribe ובתיעוד</w:t>
       </w:r>
     </w:p>
     <w:p>
@@ -243,6 +285,8 @@
       <w:r>
         <w:rPr>
           <w:sz w:val="22"/>
+          <w:rtl/>
+          <w:lang w:bidi="he-IL"/>
         </w:rPr>
         <w:t>מנהלי קליניקה (בעלים / אדמין) — ניהול צוות, הגדרות, אנליטיקות</w:t>
       </w:r>
@@ -257,6 +301,8 @@
       <w:r>
         <w:rPr>
           <w:sz w:val="22"/>
+          <w:rtl/>
+          <w:lang w:bidi="he-IL"/>
         </w:rPr>
         <w:t>פקידות קבלה — גישה מוגבלת לפרטי מטופלים</w:t>
       </w:r>
@@ -268,6 +314,10 @@
         <w:jc w:val="right"/>
       </w:pPr>
       <w:r>
+        <w:rPr>
+          <w:rtl/>
+          <w:lang w:bidi="he-IL"/>
+        </w:rPr>
         <w:t>2.2 פרופיל קליניקה טיפוסי</w:t>
       </w:r>
     </w:p>
@@ -281,6 +331,8 @@
       <w:r>
         <w:rPr>
           <w:sz w:val="22"/>
+          <w:rtl/>
+          <w:lang w:bidi="he-IL"/>
         </w:rPr>
         <w:t>1–15 מטפלים</w:t>
       </w:r>
@@ -295,6 +347,8 @@
       <w:r>
         <w:rPr>
           <w:sz w:val="22"/>
+          <w:rtl/>
+          <w:lang w:bidi="he-IL"/>
         </w:rPr>
         <w:t>50–500 מטופלים פעילים</w:t>
       </w:r>
@@ -309,6 +363,8 @@
       <w:r>
         <w:rPr>
           <w:sz w:val="22"/>
+          <w:rtl/>
+          <w:lang w:bidi="he-IL"/>
         </w:rPr>
         <w:t>ישראל, טיפול בשפה העברית</w:t>
       </w:r>
@@ -323,8 +379,10 @@
       <w:r>
         <w:rPr>
           <w:sz w:val="22"/>
+          <w:rtl/>
+          <w:lang w:bidi="he-IL"/>
         </w:rPr>
-        <w:t>סוגים: אורטופדי, נוירולוגי, ילדים, שיקום, בית חולים, רצפת אגן, וסטיבולרי</w:t>
+        <w:t>תחומים: פיזיותרפיה, קלינאות תקשורת, ריפוי בעיסוק, תזונה קלינית, סיעוד, פסיכולוגיה קלינית, כירופרקטיקה</w:t>
       </w:r>
     </w:p>
     <w:p>
@@ -346,6 +404,10 @@
         <w:jc w:val="right"/>
       </w:pPr>
       <w:r>
+        <w:rPr>
+          <w:rtl/>
+          <w:lang w:bidi="he-IL"/>
+        </w:rPr>
         <w:t>3. מודולים ויכולות</w:t>
       </w:r>
     </w:p>
@@ -356,6 +418,10 @@
         <w:jc w:val="right"/>
       </w:pPr>
       <w:r>
+        <w:rPr>
+          <w:rtl/>
+          <w:lang w:bidi="he-IL"/>
+        </w:rPr>
         <w:t>3.1 אימות משתמשים</w:t>
       </w:r>
     </w:p>
@@ -369,6 +435,8 @@
       <w:r>
         <w:rPr>
           <w:sz w:val="22"/>
+          <w:rtl/>
+          <w:lang w:bidi="he-IL"/>
         </w:rPr>
         <w:t>כניסה עם גוגל (OAuth) — חובה אישור מראש</w:t>
       </w:r>
@@ -383,6 +451,8 @@
       <w:r>
         <w:rPr>
           <w:sz w:val="22"/>
+          <w:rtl/>
+          <w:lang w:bidi="he-IL"/>
         </w:rPr>
         <w:t>מנגנון הזמנה-בלבד: רק משתמשים שהוזמנו במייל יכולים לגשת</w:t>
       </w:r>
@@ -397,6 +467,8 @@
       <w:r>
         <w:rPr>
           <w:sz w:val="22"/>
+          <w:rtl/>
+          <w:lang w:bidi="he-IL"/>
         </w:rPr>
         <w:t>חסימת הרשמה חופשית — הגנה על נתוני מטופלים</w:t>
       </w:r>
@@ -411,6 +483,8 @@
       <w:r>
         <w:rPr>
           <w:sz w:val="22"/>
+          <w:rtl/>
+          <w:lang w:bidi="he-IL"/>
         </w:rPr>
         <w:t>Super Admin: גישה לכל הקליניקות במערכת</w:t>
       </w:r>
@@ -422,6 +496,10 @@
         <w:jc w:val="right"/>
       </w:pPr>
       <w:r>
+        <w:rPr>
+          <w:rtl/>
+          <w:lang w:bidi="he-IL"/>
+        </w:rPr>
         <w:t>3.2 ניהול קליניקות רב-אתריות</w:t>
       </w:r>
     </w:p>
@@ -435,6 +513,8 @@
       <w:r>
         <w:rPr>
           <w:sz w:val="22"/>
+          <w:rtl/>
+          <w:lang w:bidi="he-IL"/>
         </w:rPr>
         <w:t>קליניקה אחת או יותר תחת אותה חשבון</w:t>
       </w:r>
@@ -449,6 +529,8 @@
       <w:r>
         <w:rPr>
           <w:sz w:val="22"/>
+          <w:rtl/>
+          <w:lang w:bidi="he-IL"/>
         </w:rPr>
         <w:t>החלפה מהירה בין קליניקות (Clinic Switcher בסרגל הצד)</w:t>
       </w:r>
@@ -463,6 +545,8 @@
       <w:r>
         <w:rPr>
           <w:sz w:val="22"/>
+          <w:rtl/>
+          <w:lang w:bidi="he-IL"/>
         </w:rPr>
         <w:t>הגדרות נפרדות לכל קליניקה (תבנית תיעוד, לוגו)</w:t>
       </w:r>
@@ -477,6 +561,8 @@
       <w:r>
         <w:rPr>
           <w:sz w:val="22"/>
+          <w:rtl/>
+          <w:lang w:bidi="he-IL"/>
         </w:rPr>
         <w:t>יצירת קליניקה חדשה ע"י Super Admin בלבד</w:t>
       </w:r>
@@ -491,6 +577,8 @@
       <w:r>
         <w:rPr>
           <w:sz w:val="22"/>
+          <w:rtl/>
+          <w:lang w:bidi="he-IL"/>
         </w:rPr>
         <w:t>Super Admin: מחיקת קליניקה עם אישור שם מדויק</w:t>
       </w:r>
@@ -502,6 +590,10 @@
         <w:jc w:val="right"/>
       </w:pPr>
       <w:r>
+        <w:rPr>
+          <w:rtl/>
+          <w:lang w:bidi="he-IL"/>
+        </w:rPr>
         <w:t>3.3 ניהול משתמשים והרשאות</w:t>
       </w:r>
     </w:p>
@@ -515,6 +607,8 @@
       <w:r>
         <w:rPr>
           <w:sz w:val="22"/>
+          <w:rtl/>
+          <w:lang w:bidi="he-IL"/>
         </w:rPr>
         <w:t>תפקידים: בעלים, מנהל, מטפל/ת, קבלה</w:t>
       </w:r>
@@ -529,6 +623,8 @@
       <w:r>
         <w:rPr>
           <w:sz w:val="22"/>
+          <w:rtl/>
+          <w:lang w:bidi="he-IL"/>
         </w:rPr>
         <w:t>הזמנת חבר צוות במייל</w:t>
       </w:r>
@@ -543,6 +639,8 @@
       <w:r>
         <w:rPr>
           <w:sz w:val="22"/>
+          <w:rtl/>
+          <w:lang w:bidi="he-IL"/>
         </w:rPr>
         <w:t>הפעלה / השהיה / מחיקה של חבר צוות</w:t>
       </w:r>
@@ -557,6 +655,8 @@
       <w:r>
         <w:rPr>
           <w:sz w:val="22"/>
+          <w:rtl/>
+          <w:lang w:bidi="he-IL"/>
         </w:rPr>
         <w:t>הצגת "התחבר לאחרונה" — זמן יחסי בעברית</w:t>
       </w:r>
@@ -571,6 +671,8 @@
       <w:r>
         <w:rPr>
           <w:sz w:val="22"/>
+          <w:rtl/>
+          <w:lang w:bidi="he-IL"/>
         </w:rPr>
         <w:t>חסימת מחיקה עצמית ומחיקת הבעלים</w:t>
       </w:r>
@@ -582,6 +684,10 @@
         <w:jc w:val="right"/>
       </w:pPr>
       <w:r>
+        <w:rPr>
+          <w:rtl/>
+          <w:lang w:bidi="he-IL"/>
+        </w:rPr>
         <w:t>3.4 ניהול מטופלים</w:t>
       </w:r>
     </w:p>
@@ -595,6 +701,8 @@
       <w:r>
         <w:rPr>
           <w:sz w:val="22"/>
+          <w:rtl/>
+          <w:lang w:bidi="he-IL"/>
         </w:rPr>
         <w:t>יצירה ועדכון: שם, ת.ז., תאריך לידה, טלפון, מייל, קופת חולים, אבחנה</w:t>
       </w:r>
@@ -609,6 +717,8 @@
       <w:r>
         <w:rPr>
           <w:sz w:val="22"/>
+          <w:rtl/>
+          <w:lang w:bidi="he-IL"/>
         </w:rPr>
         <w:t>סימון "תביעת ביטוח לאומי" לכל מטופל</w:t>
       </w:r>
@@ -623,6 +733,8 @@
       <w:r>
         <w:rPr>
           <w:sz w:val="22"/>
+          <w:rtl/>
+          <w:lang w:bidi="he-IL"/>
         </w:rPr>
         <w:t>סטטוס: פעיל / שוחרר / בהמתנה</w:t>
       </w:r>
@@ -637,6 +749,8 @@
       <w:r>
         <w:rPr>
           <w:sz w:val="22"/>
+          <w:rtl/>
+          <w:lang w:bidi="he-IL"/>
         </w:rPr>
         <w:t>היסטוריית טיפולים כרונולוגית עם תרשים VAS</w:t>
       </w:r>
@@ -651,6 +765,8 @@
       <w:r>
         <w:rPr>
           <w:sz w:val="22"/>
+          <w:rtl/>
+          <w:lang w:bidi="he-IL"/>
         </w:rPr>
         <w:t>קישור ישיר למסמכים שנוצרו</w:t>
       </w:r>
@@ -662,6 +778,10 @@
         <w:jc w:val="right"/>
       </w:pPr>
       <w:r>
+        <w:rPr>
+          <w:rtl/>
+          <w:lang w:bidi="he-IL"/>
+        </w:rPr>
         <w:t>3.5 AI Scribe — תיעוד קולי</w:t>
       </w:r>
     </w:p>
@@ -675,8 +795,10 @@
         <w:rPr>
           <w:b/>
           <w:sz w:val="22"/>
+          <w:rtl/>
+          <w:lang w:bidi="he-IL"/>
         </w:rPr>
-        <w:t>הלב של המוצר. פיזיותרפיסט מקליט את שיחת הטיפול — ה-AI מתמלל וכותב רשומה קלינית.</w:t>
+        <w:t>הלב של המוצר. המטפל מקליט את שיחת הטיפול — ה-AI מתמלל וכותב רשומה קלינית מותאמת לתחום.</w:t>
       </w:r>
     </w:p>
     <w:p>
@@ -689,12 +811,16 @@
         <w:rPr>
           <w:b/>
           <w:sz w:val="22"/>
+          <w:rtl/>
+          <w:lang w:bidi="he-IL"/>
         </w:rPr>
         <w:t xml:space="preserve">זרימת עבודה: </w:t>
       </w:r>
       <w:r>
         <w:rPr>
           <w:sz w:val="22"/>
+          <w:rtl/>
+          <w:lang w:bidi="he-IL"/>
         </w:rPr>
         <w:t>הקלטה ← תמלול עברית (Deepgram Nova-2 / Whisper) ← יצירת רשומה (Claude AI) ← עריכה ← שמירה</w:t>
       </w:r>
@@ -709,6 +835,8 @@
       <w:r>
         <w:rPr>
           <w:sz w:val="22"/>
+          <w:rtl/>
+          <w:lang w:bidi="he-IL"/>
         </w:rPr>
         <w:t>מצב פקודה קולית: "פרקסיס תרשום" — מתחיל הקלטה; "פרקסיס סיים" — עוצר ומייצר רשומה</w:t>
       </w:r>
@@ -723,6 +851,8 @@
       <w:r>
         <w:rPr>
           <w:sz w:val="22"/>
+          <w:rtl/>
+          <w:lang w:bidi="he-IL"/>
         </w:rPr>
         <w:t>מצב ידני: לחיצת כפתור להפעלה ועצירה</w:t>
       </w:r>
@@ -737,6 +867,8 @@
       <w:r>
         <w:rPr>
           <w:sz w:val="22"/>
+          <w:rtl/>
+          <w:lang w:bidi="he-IL"/>
         </w:rPr>
         <w:t>ויזואליזר גלים חי בזמן ההקלטה</w:t>
       </w:r>
@@ -751,6 +883,8 @@
       <w:r>
         <w:rPr>
           <w:sz w:val="22"/>
+          <w:rtl/>
+          <w:lang w:bidi="he-IL"/>
         </w:rPr>
         <w:t>עריכת הרשומה לפני שמירה</w:t>
       </w:r>
@@ -765,6 +899,8 @@
       <w:r>
         <w:rPr>
           <w:sz w:val="22"/>
+          <w:rtl/>
+          <w:lang w:bidi="he-IL"/>
         </w:rPr>
         <w:t>שמירת VAS (דרגת כאב 0–10) לכל טיפול</w:t>
       </w:r>
@@ -776,6 +912,10 @@
         <w:jc w:val="right"/>
       </w:pPr>
       <w:r>
+        <w:rPr>
+          <w:rtl/>
+          <w:lang w:bidi="he-IL"/>
+        </w:rPr>
         <w:t>3.6 תבניות תיעוד קליניות</w:t>
       </w:r>
     </w:p>
@@ -789,8 +929,26 @@
         <w:rPr>
           <w:b w:val="0"/>
           <w:sz w:val="22"/>
+          <w:rtl/>
+          <w:lang w:bidi="he-IL"/>
         </w:rPr>
-        <w:t>הרשומה הקלינית מותאמת לסוג הקליניקה — Claude מקבל הנחיות ספציפיות לכל תחום.</w:t>
+        <w:t>הרשומה הקלינית מותאמת לסוג הקליניקה — Claude מקבל הנחיות מקצועיות ספציפיות לכל תחום.</w:t>
+      </w:r>
+    </w:p>
+    <w:p>
+      <w:pPr>
+        <w:bidi w:val="1"/>
+        <w:spacing w:before="0" w:after="40"/>
+        <w:jc w:val="right"/>
+      </w:pPr>
+      <w:r>
+        <w:rPr>
+          <w:b/>
+          <w:sz w:val="22"/>
+          <w:rtl/>
+          <w:lang w:bidi="he-IL"/>
+        </w:rPr>
+        <w:t>פיזיותרפיה:</w:t>
       </w:r>
     </w:p>
     <w:p>
@@ -803,6 +961,8 @@
       <w:r>
         <w:rPr>
           <w:sz w:val="22"/>
+          <w:rtl/>
+          <w:lang w:bidi="he-IL"/>
         </w:rPr>
         <w:t>🦴  אורטופדי אמבולטורי — ROM, MMT, Lachman, SLR ועוד</w:t>
       </w:r>
@@ -817,6 +977,8 @@
       <w:r>
         <w:rPr>
           <w:sz w:val="22"/>
+          <w:rtl/>
+          <w:lang w:bidi="he-IL"/>
         </w:rPr>
         <w:t>🧠  נוירולוגי אמבולטורי — Barthel, FIM, Berg, MAS, MMSE</w:t>
       </w:r>
@@ -831,6 +993,8 @@
       <w:r>
         <w:rPr>
           <w:sz w:val="22"/>
+          <w:rtl/>
+          <w:lang w:bidi="he-IL"/>
         </w:rPr>
         <w:t>🧒  ילדים והתפתחות — GMFCS, GMFM, PEDI, מיילסטונים</w:t>
       </w:r>
@@ -845,6 +1009,8 @@
       <w:r>
         <w:rPr>
           <w:sz w:val="22"/>
+          <w:rtl/>
+          <w:lang w:bidi="he-IL"/>
         </w:rPr>
         <w:t>🔄  שיקום — STG/LTG מדידים, FIM, Barthel, תכנון שחרור</w:t>
       </w:r>
@@ -859,6 +1025,8 @@
       <w:r>
         <w:rPr>
           <w:sz w:val="22"/>
+          <w:rtl/>
+          <w:lang w:bidi="he-IL"/>
         </w:rPr>
         <w:t>🏥  בית חולים — אקוטי — Weight-bearing, נוהלי בטיחות, Morse fall</w:t>
       </w:r>
@@ -873,6 +1041,8 @@
       <w:r>
         <w:rPr>
           <w:sz w:val="22"/>
+          <w:rtl/>
+          <w:lang w:bidi="he-IL"/>
         </w:rPr>
         <w:t>🌸  רצפת אגן — Oxford 0-5, PFDI-20, ביופידבק</w:t>
       </w:r>
@@ -887,12 +1057,30 @@
       <w:r>
         <w:rPr>
           <w:sz w:val="22"/>
+          <w:rtl/>
+          <w:lang w:bidi="he-IL"/>
         </w:rPr>
         <w:t>🌀  וסטיבולרי — Dix-Hallpike, Epley, DHI, nystagmus</w:t>
       </w:r>
     </w:p>
     <w:p>
       <w:pPr>
+        <w:bidi w:val="1"/>
+        <w:spacing w:before="120" w:after="40"/>
+        <w:jc w:val="right"/>
+      </w:pPr>
+      <w:r>
+        <w:rPr>
+          <w:b/>
+          <w:sz w:val="22"/>
+          <w:rtl/>
+          <w:lang w:bidi="he-IL"/>
+        </w:rPr>
+        <w:t>קלינאות תקשורת:</w:t>
+      </w:r>
+    </w:p>
+    <w:p>
+      <w:pPr>
         <w:pStyle w:val="ListBullet"/>
         <w:bidi w:val="1"/>
         <w:spacing w:after="60"/>
@@ -901,8 +1089,170 @@
       <w:r>
         <w:rPr>
           <w:sz w:val="22"/>
+          <w:rtl/>
+          <w:lang w:bidi="he-IL"/>
         </w:rPr>
-        <w:t>📋  תבנית מותאמת — מדביק דגימה → Claude מנתח → מגדיר סעיפים אוטומטית</w:t>
+        <w:t>🗣️  מבוגרים — אפזיה, דיספגיה, קול, WAB-R, ASHA NOMS, DOSS</w:t>
+      </w:r>
+    </w:p>
+    <w:p>
+      <w:pPr>
+        <w:pStyle w:val="ListBullet"/>
+        <w:bidi w:val="1"/>
+        <w:spacing w:after="60"/>
+        <w:jc w:val="right"/>
+      </w:pPr>
+      <w:r>
+        <w:rPr>
+          <w:sz w:val="22"/>
+          <w:rtl/>
+          <w:lang w:bidi="he-IL"/>
+        </w:rPr>
+        <w:t>🌱  ילדים — עיכוב שפה, ASD, פונולוגיה, PLS-5, GFTA-3, CELF</w:t>
+      </w:r>
+    </w:p>
+    <w:p>
+      <w:pPr>
+        <w:bidi w:val="1"/>
+        <w:spacing w:before="120" w:after="40"/>
+        <w:jc w:val="right"/>
+      </w:pPr>
+      <w:r>
+        <w:rPr>
+          <w:b/>
+          <w:sz w:val="22"/>
+          <w:rtl/>
+          <w:lang w:bidi="he-IL"/>
+        </w:rPr>
+        <w:t>ריפוי בעיסוק:</w:t>
+      </w:r>
+    </w:p>
+    <w:p>
+      <w:pPr>
+        <w:pStyle w:val="ListBullet"/>
+        <w:bidi w:val="1"/>
+        <w:spacing w:after="60"/>
+        <w:jc w:val="right"/>
+      </w:pPr>
+      <w:r>
+        <w:rPr>
+          <w:sz w:val="22"/>
+          <w:rtl/>
+          <w:lang w:bidi="he-IL"/>
+        </w:rPr>
+        <w:t>🤲  מבוגרים — ADL/IADL, כוח יד, קוגניציה, COPM, AMPS, FIM</w:t>
+      </w:r>
+    </w:p>
+    <w:p>
+      <w:pPr>
+        <w:pStyle w:val="ListBullet"/>
+        <w:bidi w:val="1"/>
+        <w:spacing w:after="60"/>
+        <w:jc w:val="right"/>
+      </w:pPr>
+      <w:r>
+        <w:rPr>
+          <w:sz w:val="22"/>
+          <w:rtl/>
+          <w:lang w:bidi="he-IL"/>
+        </w:rPr>
+        <w:t>🎨  ילדים — עיבוד חושי SI, DCD, כתיבה, SPM, MABC-2, BOT-2</w:t>
+      </w:r>
+    </w:p>
+    <w:p>
+      <w:pPr>
+        <w:bidi w:val="1"/>
+        <w:spacing w:before="120" w:after="40"/>
+        <w:jc w:val="right"/>
+      </w:pPr>
+      <w:r>
+        <w:rPr>
+          <w:b/>
+          <w:sz w:val="22"/>
+          <w:rtl/>
+          <w:lang w:bidi="he-IL"/>
+        </w:rPr>
+        <w:t>תחומים נוספים:</w:t>
+      </w:r>
+    </w:p>
+    <w:p>
+      <w:pPr>
+        <w:pStyle w:val="ListBullet"/>
+        <w:bidi w:val="1"/>
+        <w:spacing w:after="60"/>
+        <w:jc w:val="right"/>
+      </w:pPr>
+      <w:r>
+        <w:rPr>
+          <w:sz w:val="22"/>
+          <w:rtl/>
+          <w:lang w:bidi="he-IL"/>
+        </w:rPr>
+        <w:t>🥗  תזונה קלינית — BMI, SGA, MNA, Harris-Benedict, תוכנית תפריט</w:t>
+      </w:r>
+    </w:p>
+    <w:p>
+      <w:pPr>
+        <w:pStyle w:val="ListBullet"/>
+        <w:bidi w:val="1"/>
+        <w:spacing w:after="60"/>
+        <w:jc w:val="right"/>
+      </w:pPr>
+      <w:r>
+        <w:rPr>
+          <w:sz w:val="22"/>
+          <w:rtl/>
+          <w:lang w:bidi="he-IL"/>
+        </w:rPr>
+        <w:t>💊  סיעוד קהילתי — סימנים חיוניים, PUSH score, NANDA, Barthel/Katz</w:t>
+      </w:r>
+    </w:p>
+    <w:p>
+      <w:pPr>
+        <w:pStyle w:val="ListBullet"/>
+        <w:bidi w:val="1"/>
+        <w:spacing w:after="60"/>
+        <w:jc w:val="right"/>
+      </w:pPr>
+      <w:r>
+        <w:rPr>
+          <w:sz w:val="22"/>
+          <w:rtl/>
+          <w:lang w:bidi="he-IL"/>
+        </w:rPr>
+        <w:t>🧩  פסיכולוגיה קלינית — MSE, PHQ-9/GAD-7, CBT/DBT פרמולציה, C-SSRS</w:t>
+      </w:r>
+    </w:p>
+    <w:p>
+      <w:pPr>
+        <w:pStyle w:val="ListBullet"/>
+        <w:bidi w:val="1"/>
+        <w:spacing w:after="60"/>
+        <w:jc w:val="right"/>
+      </w:pPr>
+      <w:r>
+        <w:rPr>
+          <w:sz w:val="22"/>
+          <w:rtl/>
+          <w:lang w:bidi="he-IL"/>
+        </w:rPr>
+        <w:t>🔧  כירופרקטיקה — Subluxation complex, HVLA, Kemp, Spurling, ROM</w:t>
+      </w:r>
+    </w:p>
+    <w:p>
+      <w:pPr>
+        <w:pStyle w:val="ListBullet"/>
+        <w:bidi w:val="1"/>
+        <w:spacing w:after="60"/>
+        <w:jc w:val="right"/>
+      </w:pPr>
+      <w:r>
+        <w:rPr>
+          <w:sz w:val="22"/>
+          <w:rtl/>
+          <w:lang w:bidi="he-IL"/>
+        </w:rPr>
+        <w:t>📋  תבנית מותאמת — הדבקת דגימה → Claude מנתח → מגדיר סעיפים אוטומטית</w:t>
       </w:r>
     </w:p>
     <w:p>
@@ -915,6 +1265,8 @@
         <w:rPr>
           <w:b w:val="0"/>
           <w:sz w:val="22"/>
+          <w:rtl/>
+          <w:lang w:bidi="he-IL"/>
         </w:rPr>
         <w:t>שינוי תבנית חל מיידית: טופס תיעוד ידני, בקשת AI Scribe, ועזרת AI בצ'אט.</w:t>
       </w:r>
@@ -926,6 +1278,10 @@
         <w:jc w:val="right"/>
       </w:pPr>
       <w:r>
+        <w:rPr>
+          <w:rtl/>
+          <w:lang w:bidi="he-IL"/>
+        </w:rPr>
         <w:t>3.7 יצירת מסמכים אוטומטית</w:t>
       </w:r>
     </w:p>
@@ -939,6 +1295,8 @@
       <w:r>
         <w:rPr>
           <w:sz w:val="22"/>
+          <w:rtl/>
+          <w:lang w:bidi="he-IL"/>
         </w:rPr>
         <w:t>מכתב לביטוח לאומי</w:t>
       </w:r>
@@ -953,8 +1311,10 @@
       <w:r>
         <w:rPr>
           <w:sz w:val="22"/>
+          <w:rtl/>
+          <w:lang w:bidi="he-IL"/>
         </w:rPr>
-        <w:t>הפניה לאורתופד / רופא</w:t>
+        <w:t>הפניה לרופא / ספציאליסט</w:t>
       </w:r>
     </w:p>
     <w:p>
@@ -967,6 +1327,8 @@
       <w:r>
         <w:rPr>
           <w:sz w:val="22"/>
+          <w:rtl/>
+          <w:lang w:bidi="he-IL"/>
         </w:rPr>
         <w:t>דו"ח התקדמות</w:t>
       </w:r>
@@ -981,6 +1343,8 @@
       <w:r>
         <w:rPr>
           <w:sz w:val="22"/>
+          <w:rtl/>
+          <w:lang w:bidi="he-IL"/>
         </w:rPr>
         <w:t>סיכום שחרור</w:t>
       </w:r>
@@ -995,6 +1359,8 @@
       <w:r>
         <w:rPr>
           <w:sz w:val="22"/>
+          <w:rtl/>
+          <w:lang w:bidi="he-IL"/>
         </w:rPr>
         <w:t>תביעת ביטוח</w:t>
       </w:r>
@@ -1009,6 +1375,8 @@
       <w:r>
         <w:rPr>
           <w:sz w:val="22"/>
+          <w:rtl/>
+          <w:lang w:bidi="he-IL"/>
         </w:rPr>
         <w:t>אישור מחלה</w:t>
       </w:r>
@@ -1023,6 +1391,8 @@
         <w:rPr>
           <w:b w:val="0"/>
           <w:sz w:val="22"/>
+          <w:rtl/>
+          <w:lang w:bidi="he-IL"/>
         </w:rPr>
         <w:t>מסמכים נשמרים כטיוטה / סופי, מקושרים למטופל.</w:t>
       </w:r>
@@ -1034,6 +1404,10 @@
         <w:jc w:val="right"/>
       </w:pPr>
       <w:r>
+        <w:rPr>
+          <w:rtl/>
+          <w:lang w:bidi="he-IL"/>
+        </w:rPr>
         <w:t>3.8 צ'אט AI קליני</w:t>
       </w:r>
     </w:p>
@@ -1047,8 +1421,10 @@
       <w:r>
         <w:rPr>
           <w:sz w:val="22"/>
+          <w:rtl/>
+          <w:lang w:bidi="he-IL"/>
         </w:rPr>
-        <w:t>עוזר AI בעברית המתמחה בפיזיותרפיה</w:t>
+        <w:t>עוזר AI בעברית המתמחה בתחום הפרא-רפואי</w:t>
       </w:r>
     </w:p>
     <w:p>
@@ -1061,6 +1437,8 @@
       <w:r>
         <w:rPr>
           <w:sz w:val="22"/>
+          <w:rtl/>
+          <w:lang w:bidi="he-IL"/>
         </w:rPr>
         <w:t>עונה על שאלות פרוטוקול, אנטומיה, פתולוגיות</w:t>
       </w:r>
@@ -1075,6 +1453,8 @@
       <w:r>
         <w:rPr>
           <w:sz w:val="22"/>
+          <w:rtl/>
+          <w:lang w:bidi="he-IL"/>
         </w:rPr>
         <w:t>מכיר את תבנית התיעוד של הקליניקה</w:t>
       </w:r>
@@ -1089,6 +1469,8 @@
       <w:r>
         <w:rPr>
           <w:sz w:val="22"/>
+          <w:rtl/>
+          <w:lang w:bidi="he-IL"/>
         </w:rPr>
         <w:t>מוגבל לנושאים קליניים בלבד</w:t>
       </w:r>
@@ -1100,6 +1482,10 @@
         <w:jc w:val="right"/>
       </w:pPr>
       <w:r>
+        <w:rPr>
+          <w:rtl/>
+          <w:lang w:bidi="he-IL"/>
+        </w:rPr>
         <w:t>3.9 אנליטיקות</w:t>
       </w:r>
     </w:p>
@@ -1113,6 +1499,8 @@
       <w:r>
         <w:rPr>
           <w:sz w:val="22"/>
+          <w:rtl/>
+          <w:lang w:bidi="he-IL"/>
         </w:rPr>
         <w:t>תרשים מגמת VAS למטופל בודד (לפחות 2 נקודות נדרשות)</w:t>
       </w:r>
@@ -1127,6 +1515,8 @@
       <w:r>
         <w:rPr>
           <w:sz w:val="22"/>
+          <w:rtl/>
+          <w:lang w:bidi="he-IL"/>
         </w:rPr>
         <w:t>סה"כ טיפולים לפי תקופה</w:t>
       </w:r>
@@ -1141,6 +1531,8 @@
       <w:r>
         <w:rPr>
           <w:sz w:val="22"/>
+          <w:rtl/>
+          <w:lang w:bidi="he-IL"/>
         </w:rPr>
         <w:t>(מתוכנן) השוואת מטפלים, ימי שיא, ממוצע טיפולים למטופל</w:t>
       </w:r>
@@ -1152,6 +1544,10 @@
         <w:jc w:val="right"/>
       </w:pPr>
       <w:r>
+        <w:rPr>
+          <w:rtl/>
+          <w:lang w:bidi="he-IL"/>
+        </w:rPr>
         <w:t>3.10 מרכז קליטה (Onboarding)</w:t>
       </w:r>
     </w:p>
@@ -1165,6 +1561,8 @@
       <w:r>
         <w:rPr>
           <w:sz w:val="22"/>
+          <w:rtl/>
+          <w:lang w:bidi="he-IL"/>
         </w:rPr>
         <w:t>סיור כניסה ראשון — 4 שקופיות המסבירות את המוצר</w:t>
       </w:r>
@@ -1179,6 +1577,8 @@
       <w:r>
         <w:rPr>
           <w:sz w:val="22"/>
+          <w:rtl/>
+          <w:lang w:bidi="he-IL"/>
         </w:rPr>
         <w:t>מחוון התקדמות עגול (progress ring) בפינה שמאל-תחתית</w:t>
       </w:r>
@@ -1193,6 +1593,8 @@
       <w:r>
         <w:rPr>
           <w:sz w:val="22"/>
+          <w:rtl/>
+          <w:lang w:bidi="he-IL"/>
         </w:rPr>
         <w:t>צ'קליסט: מטופל ראשון, טיפול ראשון, מסמך ראשון, תבנית, הזמנת צוות</w:t>
       </w:r>
@@ -1207,6 +1609,8 @@
       <w:r>
         <w:rPr>
           <w:sz w:val="22"/>
+          <w:rtl/>
+          <w:lang w:bidi="he-IL"/>
         </w:rPr>
         <w:t>מתעדכן אוטומטית עם כל פעולה שמתבצעת</w:t>
       </w:r>
@@ -1221,6 +1625,8 @@
       <w:r>
         <w:rPr>
           <w:sz w:val="22"/>
+          <w:rtl/>
+          <w:lang w:bidi="he-IL"/>
         </w:rPr>
         <w:t>ניתן לסגירה לצמיתות לאחר השלמה</w:t>
       </w:r>
@@ -1244,6 +1650,10 @@
         <w:jc w:val="right"/>
       </w:pPr>
       <w:r>
+        <w:rPr>
+          <w:rtl/>
+          <w:lang w:bidi="he-IL"/>
+        </w:rPr>
         <w:t>4. תפקידים והרשאות</w:t>
       </w:r>
     </w:p>
@@ -1253,6 +1663,7 @@
         <w:tblW w:type="auto" w:w="0"/>
         <w:jc w:val="center"/>
         <w:tblLook w:firstColumn="1" w:firstRow="1" w:lastColumn="0" w:lastRow="0" w:noHBand="0" w:noVBand="1" w:val="04A0"/>
+        <w:bidiVisual/>
       </w:tblPr>
       <w:tblGrid>
         <w:gridCol w:w="1814"/>
@@ -1268,11 +1679,16 @@
           </w:tcPr>
           <w:p>
             <w:pPr>
-              <w:jc w:val="center"/>
+              <w:jc w:val="right"/>
+              <w:bidi w:val="1"/>
             </w:pPr>
             <w:r>
               <w:rPr>
                 <w:b/>
+                <w:rtl/>
+                <w:lang w:bidi="he-IL"/>
+                <w:rtl/>
+                <w:lang w:bidi="he-IL"/>
               </w:rPr>
               <w:t>יכולת</w:t>
             </w:r>
@@ -1284,11 +1700,16 @@
           </w:tcPr>
           <w:p>
             <w:pPr>
-              <w:jc w:val="center"/>
+              <w:jc w:val="right"/>
+              <w:bidi w:val="1"/>
             </w:pPr>
             <w:r>
               <w:rPr>
                 <w:b/>
+                <w:rtl/>
+                <w:lang w:bidi="he-IL"/>
+                <w:rtl/>
+                <w:lang w:bidi="he-IL"/>
               </w:rPr>
               <w:t>בעלים</w:t>
             </w:r>
@@ -1300,11 +1721,16 @@
           </w:tcPr>
           <w:p>
             <w:pPr>
-              <w:jc w:val="center"/>
+              <w:jc w:val="right"/>
+              <w:bidi w:val="1"/>
             </w:pPr>
             <w:r>
               <w:rPr>
                 <w:b/>
+                <w:rtl/>
+                <w:lang w:bidi="he-IL"/>
+                <w:rtl/>
+                <w:lang w:bidi="he-IL"/>
               </w:rPr>
               <w:t>מנהל</w:t>
             </w:r>
@@ -1316,11 +1742,16 @@
           </w:tcPr>
           <w:p>
             <w:pPr>
-              <w:jc w:val="center"/>
+              <w:jc w:val="right"/>
+              <w:bidi w:val="1"/>
             </w:pPr>
             <w:r>
               <w:rPr>
                 <w:b/>
+                <w:rtl/>
+                <w:lang w:bidi="he-IL"/>
+                <w:rtl/>
+                <w:lang w:bidi="he-IL"/>
               </w:rPr>
               <w:t>מטפל/ת</w:t>
             </w:r>
@@ -1332,11 +1763,16 @@
           </w:tcPr>
           <w:p>
             <w:pPr>
-              <w:jc w:val="center"/>
+              <w:jc w:val="right"/>
+              <w:bidi w:val="1"/>
             </w:pPr>
             <w:r>
               <w:rPr>
                 <w:b/>
+                <w:rtl/>
+                <w:lang w:bidi="he-IL"/>
+                <w:rtl/>
+                <w:lang w:bidi="he-IL"/>
               </w:rPr>
               <w:t>קבלה</w:t>
             </w:r>
@@ -1350,9 +1786,16 @@
           </w:tcPr>
           <w:p>
             <w:pPr>
-              <w:jc w:val="center"/>
+              <w:jc w:val="right"/>
+              <w:bidi w:val="1"/>
             </w:pPr>
             <w:r>
+              <w:rPr>
+                <w:rtl/>
+                <w:lang w:bidi="he-IL"/>
+                <w:rtl/>
+                <w:lang w:bidi="he-IL"/>
+              </w:rPr>
               <w:t>ניהול מטופלים</w:t>
             </w:r>
           </w:p>
@@ -1363,9 +1806,16 @@
           </w:tcPr>
           <w:p>
             <w:pPr>
-              <w:jc w:val="center"/>
+              <w:jc w:val="right"/>
+              <w:bidi w:val="1"/>
             </w:pPr>
             <w:r>
+              <w:rPr>
+                <w:rtl/>
+                <w:lang w:bidi="he-IL"/>
+                <w:rtl/>
+                <w:lang w:bidi="he-IL"/>
+              </w:rPr>
               <w:t>✓</w:t>
             </w:r>
           </w:p>
@@ -1376,9 +1826,16 @@
           </w:tcPr>
           <w:p>
             <w:pPr>
-              <w:jc w:val="center"/>
+              <w:jc w:val="right"/>
+              <w:bidi w:val="1"/>
             </w:pPr>
             <w:r>
+              <w:rPr>
+                <w:rtl/>
+                <w:lang w:bidi="he-IL"/>
+                <w:rtl/>
+                <w:lang w:bidi="he-IL"/>
+              </w:rPr>
               <w:t>✓</w:t>
             </w:r>
           </w:p>
@@ -1389,9 +1846,16 @@
           </w:tcPr>
           <w:p>
             <w:pPr>
-              <w:jc w:val="center"/>
+              <w:jc w:val="right"/>
+              <w:bidi w:val="1"/>
             </w:pPr>
             <w:r>
+              <w:rPr>
+                <w:rtl/>
+                <w:lang w:bidi="he-IL"/>
+                <w:rtl/>
+                <w:lang w:bidi="he-IL"/>
+              </w:rPr>
               <w:t>✓</w:t>
             </w:r>
           </w:p>
@@ -1402,9 +1866,16 @@
           </w:tcPr>
           <w:p>
             <w:pPr>
-              <w:jc w:val="center"/>
+              <w:jc w:val="right"/>
+              <w:bidi w:val="1"/>
             </w:pPr>
             <w:r>
+              <w:rPr>
+                <w:rtl/>
+                <w:lang w:bidi="he-IL"/>
+                <w:rtl/>
+                <w:lang w:bidi="he-IL"/>
+              </w:rPr>
               <w:t>✓</w:t>
             </w:r>
           </w:p>
@@ -1417,9 +1888,16 @@
           </w:tcPr>
           <w:p>
             <w:pPr>
-              <w:jc w:val="center"/>
+              <w:jc w:val="right"/>
+              <w:bidi w:val="1"/>
             </w:pPr>
             <w:r>
+              <w:rPr>
+                <w:rtl/>
+                <w:lang w:bidi="he-IL"/>
+                <w:rtl/>
+                <w:lang w:bidi="he-IL"/>
+              </w:rPr>
               <w:t>AI Scribe + תיעוד</w:t>
             </w:r>
           </w:p>
@@ -1430,9 +1908,16 @@
           </w:tcPr>
           <w:p>
             <w:pPr>
-              <w:jc w:val="center"/>
+              <w:jc w:val="right"/>
+              <w:bidi w:val="1"/>
             </w:pPr>
             <w:r>
+              <w:rPr>
+                <w:rtl/>
+                <w:lang w:bidi="he-IL"/>
+                <w:rtl/>
+                <w:lang w:bidi="he-IL"/>
+              </w:rPr>
               <w:t>✓</w:t>
             </w:r>
           </w:p>
@@ -1443,9 +1928,16 @@
           </w:tcPr>
           <w:p>
             <w:pPr>
-              <w:jc w:val="center"/>
+              <w:jc w:val="right"/>
+              <w:bidi w:val="1"/>
             </w:pPr>
             <w:r>
+              <w:rPr>
+                <w:rtl/>
+                <w:lang w:bidi="he-IL"/>
+                <w:rtl/>
+                <w:lang w:bidi="he-IL"/>
+              </w:rPr>
               <w:t>✓</w:t>
             </w:r>
           </w:p>
@@ -1456,9 +1948,16 @@
           </w:tcPr>
           <w:p>
             <w:pPr>
-              <w:jc w:val="center"/>
+              <w:jc w:val="right"/>
+              <w:bidi w:val="1"/>
             </w:pPr>
             <w:r>
+              <w:rPr>
+                <w:rtl/>
+                <w:lang w:bidi="he-IL"/>
+                <w:rtl/>
+                <w:lang w:bidi="he-IL"/>
+              </w:rPr>
               <w:t>✓</w:t>
             </w:r>
           </w:p>
@@ -1469,9 +1968,16 @@
           </w:tcPr>
           <w:p>
             <w:pPr>
-              <w:jc w:val="center"/>
+              <w:jc w:val="right"/>
+              <w:bidi w:val="1"/>
             </w:pPr>
             <w:r>
+              <w:rPr>
+                <w:rtl/>
+                <w:lang w:bidi="he-IL"/>
+                <w:rtl/>
+                <w:lang w:bidi="he-IL"/>
+              </w:rPr>
               <w:t>✗</w:t>
             </w:r>
           </w:p>
@@ -1484,9 +1990,16 @@
           </w:tcPr>
           <w:p>
             <w:pPr>
-              <w:jc w:val="center"/>
+              <w:jc w:val="right"/>
+              <w:bidi w:val="1"/>
             </w:pPr>
             <w:r>
+              <w:rPr>
+                <w:rtl/>
+                <w:lang w:bidi="he-IL"/>
+                <w:rtl/>
+                <w:lang w:bidi="he-IL"/>
+              </w:rPr>
               <w:t>יצירת מסמכים</w:t>
             </w:r>
           </w:p>
@@ -1497,9 +2010,16 @@
           </w:tcPr>
           <w:p>
             <w:pPr>
-              <w:jc w:val="center"/>
+              <w:jc w:val="right"/>
+              <w:bidi w:val="1"/>
             </w:pPr>
             <w:r>
+              <w:rPr>
+                <w:rtl/>
+                <w:lang w:bidi="he-IL"/>
+                <w:rtl/>
+                <w:lang w:bidi="he-IL"/>
+              </w:rPr>
               <w:t>✓</w:t>
             </w:r>
           </w:p>
@@ -1510,9 +2030,16 @@
           </w:tcPr>
           <w:p>
             <w:pPr>
-              <w:jc w:val="center"/>
+              <w:jc w:val="right"/>
+              <w:bidi w:val="1"/>
             </w:pPr>
             <w:r>
+              <w:rPr>
+                <w:rtl/>
+                <w:lang w:bidi="he-IL"/>
+                <w:rtl/>
+                <w:lang w:bidi="he-IL"/>
+              </w:rPr>
               <w:t>✓</w:t>
             </w:r>
           </w:p>
@@ -1523,9 +2050,16 @@
           </w:tcPr>
           <w:p>
             <w:pPr>
-              <w:jc w:val="center"/>
+              <w:jc w:val="right"/>
+              <w:bidi w:val="1"/>
             </w:pPr>
             <w:r>
+              <w:rPr>
+                <w:rtl/>
+                <w:lang w:bidi="he-IL"/>
+                <w:rtl/>
+                <w:lang w:bidi="he-IL"/>
+              </w:rPr>
               <w:t>✓</w:t>
             </w:r>
           </w:p>
@@ -1536,9 +2070,16 @@
           </w:tcPr>
           <w:p>
             <w:pPr>
-              <w:jc w:val="center"/>
+              <w:jc w:val="right"/>
+              <w:bidi w:val="1"/>
             </w:pPr>
             <w:r>
+              <w:rPr>
+                <w:rtl/>
+                <w:lang w:bidi="he-IL"/>
+                <w:rtl/>
+                <w:lang w:bidi="he-IL"/>
+              </w:rPr>
               <w:t>✗</w:t>
             </w:r>
           </w:p>
@@ -1551,9 +2092,16 @@
           </w:tcPr>
           <w:p>
             <w:pPr>
-              <w:jc w:val="center"/>
+              <w:jc w:val="right"/>
+              <w:bidi w:val="1"/>
             </w:pPr>
             <w:r>
+              <w:rPr>
+                <w:rtl/>
+                <w:lang w:bidi="he-IL"/>
+                <w:rtl/>
+                <w:lang w:bidi="he-IL"/>
+              </w:rPr>
               <w:t>ניהול משתמשים</w:t>
             </w:r>
           </w:p>
@@ -1564,9 +2112,16 @@
           </w:tcPr>
           <w:p>
             <w:pPr>
-              <w:jc w:val="center"/>
+              <w:jc w:val="right"/>
+              <w:bidi w:val="1"/>
             </w:pPr>
             <w:r>
+              <w:rPr>
+                <w:rtl/>
+                <w:lang w:bidi="he-IL"/>
+                <w:rtl/>
+                <w:lang w:bidi="he-IL"/>
+              </w:rPr>
               <w:t>✓</w:t>
             </w:r>
           </w:p>
@@ -1577,9 +2132,16 @@
           </w:tcPr>
           <w:p>
             <w:pPr>
-              <w:jc w:val="center"/>
+              <w:jc w:val="right"/>
+              <w:bidi w:val="1"/>
             </w:pPr>
             <w:r>
+              <w:rPr>
+                <w:rtl/>
+                <w:lang w:bidi="he-IL"/>
+                <w:rtl/>
+                <w:lang w:bidi="he-IL"/>
+              </w:rPr>
               <w:t>✓</w:t>
             </w:r>
           </w:p>
@@ -1590,9 +2152,16 @@
           </w:tcPr>
           <w:p>
             <w:pPr>
-              <w:jc w:val="center"/>
+              <w:jc w:val="right"/>
+              <w:bidi w:val="1"/>
             </w:pPr>
             <w:r>
+              <w:rPr>
+                <w:rtl/>
+                <w:lang w:bidi="he-IL"/>
+                <w:rtl/>
+                <w:lang w:bidi="he-IL"/>
+              </w:rPr>
               <w:t>✗</w:t>
             </w:r>
           </w:p>
@@ -1603,9 +2172,16 @@
           </w:tcPr>
           <w:p>
             <w:pPr>
-              <w:jc w:val="center"/>
+              <w:jc w:val="right"/>
+              <w:bidi w:val="1"/>
             </w:pPr>
             <w:r>
+              <w:rPr>
+                <w:rtl/>
+                <w:lang w:bidi="he-IL"/>
+                <w:rtl/>
+                <w:lang w:bidi="he-IL"/>
+              </w:rPr>
               <w:t>✗</w:t>
             </w:r>
           </w:p>
@@ -1618,9 +2194,16 @@
           </w:tcPr>
           <w:p>
             <w:pPr>
-              <w:jc w:val="center"/>
+              <w:jc w:val="right"/>
+              <w:bidi w:val="1"/>
             </w:pPr>
             <w:r>
+              <w:rPr>
+                <w:rtl/>
+                <w:lang w:bidi="he-IL"/>
+                <w:rtl/>
+                <w:lang w:bidi="he-IL"/>
+              </w:rPr>
               <w:t>הגדרות תבנית</w:t>
             </w:r>
           </w:p>
@@ -1631,9 +2214,16 @@
           </w:tcPr>
           <w:p>
             <w:pPr>
-              <w:jc w:val="center"/>
+              <w:jc w:val="right"/>
+              <w:bidi w:val="1"/>
             </w:pPr>
             <w:r>
+              <w:rPr>
+                <w:rtl/>
+                <w:lang w:bidi="he-IL"/>
+                <w:rtl/>
+                <w:lang w:bidi="he-IL"/>
+              </w:rPr>
               <w:t>✓</w:t>
             </w:r>
           </w:p>
@@ -1644,9 +2234,16 @@
           </w:tcPr>
           <w:p>
             <w:pPr>
-              <w:jc w:val="center"/>
+              <w:jc w:val="right"/>
+              <w:bidi w:val="1"/>
             </w:pPr>
             <w:r>
+              <w:rPr>
+                <w:rtl/>
+                <w:lang w:bidi="he-IL"/>
+                <w:rtl/>
+                <w:lang w:bidi="he-IL"/>
+              </w:rPr>
               <w:t>✓</w:t>
             </w:r>
           </w:p>
@@ -1657,9 +2254,16 @@
           </w:tcPr>
           <w:p>
             <w:pPr>
-              <w:jc w:val="center"/>
+              <w:jc w:val="right"/>
+              <w:bidi w:val="1"/>
             </w:pPr>
             <w:r>
+              <w:rPr>
+                <w:rtl/>
+                <w:lang w:bidi="he-IL"/>
+                <w:rtl/>
+                <w:lang w:bidi="he-IL"/>
+              </w:rPr>
               <w:t>✗</w:t>
             </w:r>
           </w:p>
@@ -1670,9 +2274,16 @@
           </w:tcPr>
           <w:p>
             <w:pPr>
-              <w:jc w:val="center"/>
+              <w:jc w:val="right"/>
+              <w:bidi w:val="1"/>
             </w:pPr>
             <w:r>
+              <w:rPr>
+                <w:rtl/>
+                <w:lang w:bidi="he-IL"/>
+                <w:rtl/>
+                <w:lang w:bidi="he-IL"/>
+              </w:rPr>
               <w:t>✗</w:t>
             </w:r>
           </w:p>
@@ -1699,6 +2310,10 @@
         <w:jc w:val="right"/>
       </w:pPr>
       <w:r>
+        <w:rPr>
+          <w:rtl/>
+          <w:lang w:bidi="he-IL"/>
+        </w:rPr>
         <w:t>5. ארכיטקטורה טכנית</w:t>
       </w:r>
     </w:p>
@@ -1709,6 +2324,10 @@
         <w:jc w:val="right"/>
       </w:pPr>
       <w:r>
+        <w:rPr>
+          <w:rtl/>
+          <w:lang w:bidi="he-IL"/>
+        </w:rPr>
         <w:t>5.1 Stack</w:t>
       </w:r>
     </w:p>
@@ -1722,6 +2341,8 @@
       <w:r>
         <w:rPr>
           <w:sz w:val="22"/>
+          <w:rtl/>
+          <w:lang w:bidi="he-IL"/>
         </w:rPr>
         <w:t>Frontend: Next.js 14 (App Router), TypeScript, Tailwind CSS — RTL עברית מלא</w:t>
       </w:r>
@@ -1736,6 +2357,8 @@
       <w:r>
         <w:rPr>
           <w:sz w:val="22"/>
+          <w:rtl/>
+          <w:lang w:bidi="he-IL"/>
         </w:rPr>
         <w:t>Backend: API Routes של Next.js (Serverless Functions)</w:t>
       </w:r>
@@ -1750,6 +2373,8 @@
       <w:r>
         <w:rPr>
           <w:sz w:val="22"/>
+          <w:rtl/>
+          <w:lang w:bidi="he-IL"/>
         </w:rPr>
         <w:t>DB + Auth: Supabase (PostgreSQL + Row-Level Security + Google OAuth)</w:t>
       </w:r>
@@ -1764,6 +2389,8 @@
       <w:r>
         <w:rPr>
           <w:sz w:val="22"/>
+          <w:rtl/>
+          <w:lang w:bidi="he-IL"/>
         </w:rPr>
         <w:t>תמלול: Deepgram Nova-2 עברית, fallback: Whisper Large</w:t>
       </w:r>
@@ -1778,6 +2405,8 @@
       <w:r>
         <w:rPr>
           <w:sz w:val="22"/>
+          <w:rtl/>
+          <w:lang w:bidi="he-IL"/>
         </w:rPr>
         <w:t>AI: Anthropic Claude (claude-sonnet-4-6) — הפקת רשומות ומסמכים</w:t>
       </w:r>
@@ -1792,6 +2421,8 @@
       <w:r>
         <w:rPr>
           <w:sz w:val="22"/>
+          <w:rtl/>
+          <w:lang w:bidi="he-IL"/>
         </w:rPr>
         <w:t>Hosting: Vercel (CI/CD אוטומטי מ-GitHub)</w:t>
       </w:r>
@@ -1803,6 +2434,10 @@
         <w:jc w:val="right"/>
       </w:pPr>
       <w:r>
+        <w:rPr>
+          <w:rtl/>
+          <w:lang w:bidi="he-IL"/>
+        </w:rPr>
         <w:t>5.2 אבטחה</w:t>
       </w:r>
     </w:p>
@@ -1816,6 +2451,8 @@
       <w:r>
         <w:rPr>
           <w:sz w:val="22"/>
+          <w:rtl/>
+          <w:lang w:bidi="he-IL"/>
         </w:rPr>
         <w:t>Row-Level Security (RLS) — נתוני קליניקה נפרדים לחלוטין</w:t>
       </w:r>
@@ -1830,6 +2467,8 @@
       <w:r>
         <w:rPr>
           <w:sz w:val="22"/>
+          <w:rtl/>
+          <w:lang w:bidi="he-IL"/>
         </w:rPr>
         <w:t>הזמנה-בלבד — אין הרשמה חופשית</w:t>
       </w:r>
@@ -1844,6 +2483,8 @@
       <w:r>
         <w:rPr>
           <w:sz w:val="22"/>
+          <w:rtl/>
+          <w:lang w:bidi="he-IL"/>
         </w:rPr>
         <w:t>Admin Client עם Service Role Key לפעולות מנהל בלבד</w:t>
       </w:r>
@@ -1858,6 +2499,8 @@
       <w:r>
         <w:rPr>
           <w:sz w:val="22"/>
+          <w:rtl/>
+          <w:lang w:bidi="he-IL"/>
         </w:rPr>
         <w:t>Env vars מאובטחים ב-Vercel (לא ב-repo)</w:t>
       </w:r>
@@ -1869,6 +2512,10 @@
         <w:jc w:val="right"/>
       </w:pPr>
       <w:r>
+        <w:rPr>
+          <w:rtl/>
+          <w:lang w:bidi="he-IL"/>
+        </w:rPr>
         <w:t>5.3 בסיס הנתונים — טבלאות עיקריות</w:t>
       </w:r>
     </w:p>
@@ -1878,6 +2525,7 @@
         <w:tblW w:type="auto" w:w="0"/>
         <w:jc w:val="center"/>
         <w:tblLook w:firstColumn="1" w:firstRow="1" w:lastColumn="0" w:lastRow="0" w:noHBand="0" w:noVBand="1" w:val="04A0"/>
+        <w:bidiVisual/>
       </w:tblPr>
       <w:tblGrid>
         <w:gridCol w:w="4536"/>
@@ -1890,11 +2538,16 @@
           </w:tcPr>
           <w:p>
             <w:pPr>
-              <w:jc w:val="center"/>
+              <w:jc w:val="right"/>
+              <w:bidi w:val="1"/>
             </w:pPr>
             <w:r>
               <w:rPr>
                 <w:b/>
+                <w:rtl/>
+                <w:lang w:bidi="he-IL"/>
+                <w:rtl/>
+                <w:lang w:bidi="he-IL"/>
               </w:rPr>
               <w:t>טבלה</w:t>
             </w:r>
@@ -1906,11 +2559,16 @@
           </w:tcPr>
           <w:p>
             <w:pPr>
-              <w:jc w:val="center"/>
+              <w:jc w:val="right"/>
+              <w:bidi w:val="1"/>
             </w:pPr>
             <w:r>
               <w:rPr>
                 <w:b/>
+                <w:rtl/>
+                <w:lang w:bidi="he-IL"/>
+                <w:rtl/>
+                <w:lang w:bidi="he-IL"/>
               </w:rPr>
               <w:t>תוכן עיקרי</w:t>
             </w:r>
@@ -1925,8 +2583,15 @@
           <w:p>
             <w:pPr>
               <w:jc w:val="right"/>
+              <w:bidi w:val="1"/>
             </w:pPr>
             <w:r>
+              <w:rPr>
+                <w:rtl/>
+                <w:lang w:bidi="he-IL"/>
+                <w:rtl/>
+                <w:lang w:bidi="he-IL"/>
+              </w:rPr>
               <w:t>clinics</w:t>
             </w:r>
           </w:p>
@@ -1938,8 +2603,15 @@
           <w:p>
             <w:pPr>
               <w:jc w:val="right"/>
+              <w:bidi w:val="1"/>
             </w:pPr>
             <w:r>
+              <w:rPr>
+                <w:rtl/>
+                <w:lang w:bidi="he-IL"/>
+                <w:rtl/>
+                <w:lang w:bidi="he-IL"/>
+              </w:rPr>
               <w:t>שם, slug, settings JSONB (template_id, לוגו)</w:t>
             </w:r>
           </w:p>
@@ -1953,8 +2625,15 @@
           <w:p>
             <w:pPr>
               <w:jc w:val="right"/>
+              <w:bidi w:val="1"/>
             </w:pPr>
             <w:r>
+              <w:rPr>
+                <w:rtl/>
+                <w:lang w:bidi="he-IL"/>
+                <w:rtl/>
+                <w:lang w:bidi="he-IL"/>
+              </w:rPr>
               <w:t>clinic_members</w:t>
             </w:r>
           </w:p>
@@ -1966,8 +2645,15 @@
           <w:p>
             <w:pPr>
               <w:jc w:val="right"/>
+              <w:bidi w:val="1"/>
             </w:pPr>
             <w:r>
+              <w:rPr>
+                <w:rtl/>
+                <w:lang w:bidi="he-IL"/>
+                <w:rtl/>
+                <w:lang w:bidi="he-IL"/>
+              </w:rPr>
               <w:t>user_id, clinic_id, role, status, created_at</w:t>
             </w:r>
           </w:p>
@@ -1981,8 +2667,15 @@
           <w:p>
             <w:pPr>
               <w:jc w:val="right"/>
+              <w:bidi w:val="1"/>
             </w:pPr>
             <w:r>
+              <w:rPr>
+                <w:rtl/>
+                <w:lang w:bidi="he-IL"/>
+                <w:rtl/>
+                <w:lang w:bidi="he-IL"/>
+              </w:rPr>
               <w:t>profiles</w:t>
             </w:r>
           </w:p>
@@ -1994,8 +2687,15 @@
           <w:p>
             <w:pPr>
               <w:jc w:val="right"/>
+              <w:bidi w:val="1"/>
             </w:pPr>
             <w:r>
+              <w:rPr>
+                <w:rtl/>
+                <w:lang w:bidi="he-IL"/>
+                <w:rtl/>
+                <w:lang w:bidi="he-IL"/>
+              </w:rPr>
               <w:t>full_name, phone, avatar_url</w:t>
             </w:r>
           </w:p>
@@ -2009,8 +2709,15 @@
           <w:p>
             <w:pPr>
               <w:jc w:val="right"/>
+              <w:bidi w:val="1"/>
             </w:pPr>
             <w:r>
+              <w:rPr>
+                <w:rtl/>
+                <w:lang w:bidi="he-IL"/>
+                <w:rtl/>
+                <w:lang w:bidi="he-IL"/>
+              </w:rPr>
               <w:t>patients</w:t>
             </w:r>
           </w:p>
@@ -2022,8 +2729,15 @@
           <w:p>
             <w:pPr>
               <w:jc w:val="right"/>
+              <w:bidi w:val="1"/>
             </w:pPr>
             <w:r>
+              <w:rPr>
+                <w:rtl/>
+                <w:lang w:bidi="he-IL"/>
+                <w:rtl/>
+                <w:lang w:bidi="he-IL"/>
+              </w:rPr>
               <w:t>פרטים אישיים, קופה, אבחנה, סטטוס, bituach_leumi</w:t>
             </w:r>
           </w:p>
@@ -2037,8 +2751,15 @@
           <w:p>
             <w:pPr>
               <w:jc w:val="right"/>
+              <w:bidi w:val="1"/>
             </w:pPr>
             <w:r>
+              <w:rPr>
+                <w:rtl/>
+                <w:lang w:bidi="he-IL"/>
+                <w:rtl/>
+                <w:lang w:bidi="he-IL"/>
+              </w:rPr>
               <w:t>treatments</w:t>
             </w:r>
           </w:p>
@@ -2050,8 +2771,15 @@
           <w:p>
             <w:pPr>
               <w:jc w:val="right"/>
+              <w:bidi w:val="1"/>
             </w:pPr>
             <w:r>
+              <w:rPr>
+                <w:rtl/>
+                <w:lang w:bidi="he-IL"/>
+                <w:rtl/>
+                <w:lang w:bidi="he-IL"/>
+              </w:rPr>
               <w:t>subjective/objective/assessment/plan, vas, note JSONB, template_id</w:t>
             </w:r>
           </w:p>
@@ -2065,8 +2793,15 @@
           <w:p>
             <w:pPr>
               <w:jc w:val="right"/>
+              <w:bidi w:val="1"/>
             </w:pPr>
             <w:r>
+              <w:rPr>
+                <w:rtl/>
+                <w:lang w:bidi="he-IL"/>
+                <w:rtl/>
+                <w:lang w:bidi="he-IL"/>
+              </w:rPr>
               <w:t>documents</w:t>
             </w:r>
           </w:p>
@@ -2078,8 +2813,15 @@
           <w:p>
             <w:pPr>
               <w:jc w:val="right"/>
+              <w:bidi w:val="1"/>
             </w:pPr>
             <w:r>
+              <w:rPr>
+                <w:rtl/>
+                <w:lang w:bidi="he-IL"/>
+                <w:rtl/>
+                <w:lang w:bidi="he-IL"/>
+              </w:rPr>
               <w:t>type, title, content, status (draft/final)</w:t>
             </w:r>
           </w:p>
@@ -2093,8 +2835,15 @@
           <w:p>
             <w:pPr>
               <w:jc w:val="right"/>
+              <w:bidi w:val="1"/>
             </w:pPr>
             <w:r>
+              <w:rPr>
+                <w:rtl/>
+                <w:lang w:bidi="he-IL"/>
+                <w:rtl/>
+                <w:lang w:bidi="he-IL"/>
+              </w:rPr>
               <w:t>invitations</w:t>
             </w:r>
           </w:p>
@@ -2106,8 +2855,15 @@
           <w:p>
             <w:pPr>
               <w:jc w:val="right"/>
+              <w:bidi w:val="1"/>
             </w:pPr>
             <w:r>
+              <w:rPr>
+                <w:rtl/>
+                <w:lang w:bidi="he-IL"/>
+                <w:rtl/>
+                <w:lang w:bidi="he-IL"/>
+              </w:rPr>
               <w:t>email, clinic_id, role, token, status</w:t>
             </w:r>
           </w:p>
@@ -2134,6 +2890,10 @@
         <w:jc w:val="right"/>
       </w:pPr>
       <w:r>
+        <w:rPr>
+          <w:rtl/>
+          <w:lang w:bidi="he-IL"/>
+        </w:rPr>
         <w:t>6. מצב נוכחי (יוני 2026)</w:t>
       </w:r>
     </w:p>
@@ -2144,6 +2904,10 @@
         <w:jc w:val="right"/>
       </w:pPr>
       <w:r>
+        <w:rPr>
+          <w:rtl/>
+          <w:lang w:bidi="he-IL"/>
+        </w:rPr>
         <w:t>6.1 מה עובד בפרודקשן</w:t>
       </w:r>
     </w:p>
@@ -2157,6 +2921,8 @@
       <w:r>
         <w:rPr>
           <w:sz w:val="22"/>
+          <w:rtl/>
+          <w:lang w:bidi="he-IL"/>
         </w:rPr>
         <w:t>✅ אימות, הזמנות, ניהול קליניקות ומשתמשים</w:t>
       </w:r>
@@ -2171,6 +2937,8 @@
       <w:r>
         <w:rPr>
           <w:sz w:val="22"/>
+          <w:rtl/>
+          <w:lang w:bidi="he-IL"/>
         </w:rPr>
         <w:t>✅ ניהול מטופלים מלא</w:t>
       </w:r>
@@ -2185,6 +2953,8 @@
       <w:r>
         <w:rPr>
           <w:sz w:val="22"/>
+          <w:rtl/>
+          <w:lang w:bidi="he-IL"/>
         </w:rPr>
         <w:t>✅ AI Scribe — הקלטה, תמלול עברית, יצירת רשומה מובנית</w:t>
       </w:r>
@@ -2199,6 +2969,8 @@
       <w:r>
         <w:rPr>
           <w:sz w:val="22"/>
+          <w:rtl/>
+          <w:lang w:bidi="he-IL"/>
         </w:rPr>
         <w:t>✅ פקודות קוליות בעברית ("פרקסיס תרשום" / "פרקסיס סיים")</w:t>
       </w:r>
@@ -2213,8 +2985,10 @@
       <w:r>
         <w:rPr>
           <w:sz w:val="22"/>
+          <w:rtl/>
+          <w:lang w:bidi="he-IL"/>
         </w:rPr>
-        <w:t>✅ 7 תבניות קליניות מובנות + תבנית מותאמת מדגימה</w:t>
+        <w:t>✅ 15 תבניות קליניות מובנות לכל תחומי הפרא-רפואה + תבנית מותאמת</w:t>
       </w:r>
     </w:p>
     <w:p>
@@ -2227,6 +3001,8 @@
       <w:r>
         <w:rPr>
           <w:sz w:val="22"/>
+          <w:rtl/>
+          <w:lang w:bidi="he-IL"/>
         </w:rPr>
         <w:t>✅ תבנית חלה על כל מוצר: טופס ידני, AI, היסטוריה, צ'אט</w:t>
       </w:r>
@@ -2241,6 +3017,8 @@
       <w:r>
         <w:rPr>
           <w:sz w:val="22"/>
+          <w:rtl/>
+          <w:lang w:bidi="he-IL"/>
         </w:rPr>
         <w:t>✅ מסמכים (טיוטה / סופי)</w:t>
       </w:r>
@@ -2255,6 +3033,8 @@
       <w:r>
         <w:rPr>
           <w:sz w:val="22"/>
+          <w:rtl/>
+          <w:lang w:bidi="he-IL"/>
         </w:rPr>
         <w:t>✅ צ'אט AI קליני</w:t>
       </w:r>
@@ -2269,6 +3049,8 @@
       <w:r>
         <w:rPr>
           <w:sz w:val="22"/>
+          <w:rtl/>
+          <w:lang w:bidi="he-IL"/>
         </w:rPr>
         <w:t>✅ תרשים VAS (מגמת כאב) למטופל</w:t>
       </w:r>
@@ -2283,6 +3065,8 @@
       <w:r>
         <w:rPr>
           <w:sz w:val="22"/>
+          <w:rtl/>
+          <w:lang w:bidi="he-IL"/>
         </w:rPr>
         <w:t>✅ Onboarding Center עם progress ring</w:t>
       </w:r>
@@ -2297,6 +3081,8 @@
       <w:r>
         <w:rPr>
           <w:sz w:val="22"/>
+          <w:rtl/>
+          <w:lang w:bidi="he-IL"/>
         </w:rPr>
         <w:t>✅ Super Admin: ניהול קליניקות, מחיקה, מעבר בין קליניקות</w:t>
       </w:r>
@@ -2311,6 +3097,8 @@
       <w:r>
         <w:rPr>
           <w:sz w:val="22"/>
+          <w:rtl/>
+          <w:lang w:bidi="he-IL"/>
         </w:rPr>
         <w:t>✅ קליניקת דמו עם נתונים מציאותיים (6 מטופלים, 14 טיפולים)</w:t>
       </w:r>
@@ -2325,6 +3113,8 @@
       <w:r>
         <w:rPr>
           <w:sz w:val="22"/>
+          <w:rtl/>
+          <w:lang w:bidi="he-IL"/>
         </w:rPr>
         <w:t>✅ Landing page עם ROI calculator</w:t>
       </w:r>
@@ -2336,6 +3126,10 @@
         <w:jc w:val="right"/>
       </w:pPr>
       <w:r>
+        <w:rPr>
+          <w:rtl/>
+          <w:lang w:bidi="he-IL"/>
+        </w:rPr>
         <w:t>6.2 מה בתכנון / חסר</w:t>
       </w:r>
     </w:p>
@@ -2349,6 +3143,8 @@
       <w:r>
         <w:rPr>
           <w:sz w:val="22"/>
+          <w:rtl/>
+          <w:lang w:bidi="he-IL"/>
         </w:rPr>
         <w:t>⬜ אנליטיקות מורחבות — לוח בקרה מנהלי, השוואות מטפלים, KPIs</w:t>
       </w:r>
@@ -2363,6 +3159,8 @@
       <w:r>
         <w:rPr>
           <w:sz w:val="22"/>
+          <w:rtl/>
+          <w:lang w:bidi="he-IL"/>
         </w:rPr>
         <w:t>⬜ יצירת מסמכים ב-AI מלא (כרגע: עורך חינמי)</w:t>
       </w:r>
@@ -2377,6 +3175,8 @@
       <w:r>
         <w:rPr>
           <w:sz w:val="22"/>
+          <w:rtl/>
+          <w:lang w:bidi="he-IL"/>
         </w:rPr>
         <w:t>⬜ תזמון תורים / יומן</w:t>
       </w:r>
@@ -2391,6 +3191,8 @@
       <w:r>
         <w:rPr>
           <w:sz w:val="22"/>
+          <w:rtl/>
+          <w:lang w:bidi="he-IL"/>
         </w:rPr>
         <w:t>⬜ אפליקציית מובייל (iOS / Android)</w:t>
       </w:r>
@@ -2405,6 +3207,8 @@
       <w:r>
         <w:rPr>
           <w:sz w:val="22"/>
+          <w:rtl/>
+          <w:lang w:bidi="he-IL"/>
         </w:rPr>
         <w:t>⬜ חיוב / Subscription (Stripe integration)</w:t>
       </w:r>
@@ -2419,6 +3223,8 @@
       <w:r>
         <w:rPr>
           <w:sz w:val="22"/>
+          <w:rtl/>
+          <w:lang w:bidi="he-IL"/>
         </w:rPr>
         <w:t>⬜ חתימה דיגיטלית על מסמכים</w:t>
       </w:r>
@@ -2433,6 +3239,8 @@
       <w:r>
         <w:rPr>
           <w:sz w:val="22"/>
+          <w:rtl/>
+          <w:lang w:bidi="he-IL"/>
         </w:rPr>
         <w:t>⬜ ייצוא PDF / Word לרשומות</w:t>
       </w:r>
@@ -2447,6 +3255,8 @@
       <w:r>
         <w:rPr>
           <w:sz w:val="22"/>
+          <w:rtl/>
+          <w:lang w:bidi="he-IL"/>
         </w:rPr>
         <w:t>⬜ אינטגרציה עם מערכות HIS / EMR קיימות</w:t>
       </w:r>
@@ -2461,6 +3271,8 @@
       <w:r>
         <w:rPr>
           <w:sz w:val="22"/>
+          <w:rtl/>
+          <w:lang w:bidi="he-IL"/>
         </w:rPr>
         <w:t>⬜ תיעוד מרחוק (Telehealth)</w:t>
       </w:r>
@@ -2475,6 +3287,8 @@
       <w:r>
         <w:rPr>
           <w:sz w:val="22"/>
+          <w:rtl/>
+          <w:lang w:bidi="he-IL"/>
         </w:rPr>
         <w:t>⬜ תפיסת תמונות / X-ray annotation</w:t>
       </w:r>
@@ -2489,6 +3303,8 @@
       <w:r>
         <w:rPr>
           <w:sz w:val="22"/>
+          <w:rtl/>
+          <w:lang w:bidi="he-IL"/>
         </w:rPr>
         <w:t>⬜ persistence של onboarding בין מכשירים (DB במקום localStorage)</w:t>
       </w:r>
@@ -2512,6 +3328,10 @@
         <w:jc w:val="right"/>
       </w:pPr>
       <w:r>
+        <w:rPr>
+          <w:rtl/>
+          <w:lang w:bidi="he-IL"/>
+        </w:rPr>
         <w:t>7. זרימות משתמש עיקריות</w:t>
       </w:r>
     </w:p>
@@ -2522,17 +3342,15 @@
         <w:jc w:val="right"/>
       </w:pPr>
       <w:r>
+        <w:rPr>
+          <w:rtl/>
+          <w:lang w:bidi="he-IL"/>
+        </w:rPr>
         <w:t>7.1 תיעוד טיפול — Scribe</w:t>
       </w:r>
     </w:p>
     <w:p>
       <w:pPr>
-        <w:bidi w:val="1"/>
-        <w:jc w:val="right"/>
-      </w:pPr>
-    </w:p>
-    <w:p>
-      <w:pPr>
         <w:pStyle w:val="ListBullet"/>
         <w:bidi w:val="1"/>
         <w:spacing w:after="60"/>
@@ -2541,6 +3359,8 @@
       <w:r>
         <w:rPr>
           <w:sz w:val="22"/>
+          <w:rtl/>
+          <w:lang w:bidi="he-IL"/>
         </w:rPr>
         <w:t>1. כניסה לדף Scribe</w:t>
       </w:r>
@@ -2555,6 +3375,8 @@
       <w:r>
         <w:rPr>
           <w:sz w:val="22"/>
+          <w:rtl/>
+          <w:lang w:bidi="he-IL"/>
         </w:rPr>
         <w:t>2. בחירת מטופל מהרשימה</w:t>
       </w:r>
@@ -2569,6 +3391,8 @@
       <w:r>
         <w:rPr>
           <w:sz w:val="22"/>
+          <w:rtl/>
+          <w:lang w:bidi="he-IL"/>
         </w:rPr>
         <w:t>3. אמירת "פרקסיס תרשום" (או לחיצת כפתור)</w:t>
       </w:r>
@@ -2583,6 +3407,8 @@
       <w:r>
         <w:rPr>
           <w:sz w:val="22"/>
+          <w:rtl/>
+          <w:lang w:bidi="he-IL"/>
         </w:rPr>
         <w:t>4. ניהול שיחת הטיפול בחדר</w:t>
       </w:r>
@@ -2597,6 +3423,8 @@
       <w:r>
         <w:rPr>
           <w:sz w:val="22"/>
+          <w:rtl/>
+          <w:lang w:bidi="he-IL"/>
         </w:rPr>
         <w:t>5. אמירת "פרקסיס סיים"</w:t>
       </w:r>
@@ -2611,6 +3439,8 @@
       <w:r>
         <w:rPr>
           <w:sz w:val="22"/>
+          <w:rtl/>
+          <w:lang w:bidi="he-IL"/>
         </w:rPr>
         <w:t>6. AI מתמלל ויוצר רשומה קלינית תוך ~15 שניות</w:t>
       </w:r>
@@ -2625,6 +3455,8 @@
       <w:r>
         <w:rPr>
           <w:sz w:val="22"/>
+          <w:rtl/>
+          <w:lang w:bidi="he-IL"/>
         </w:rPr>
         <w:t>7. עיון, עריכה, הוספת VAS</w:t>
       </w:r>
@@ -2639,6 +3471,8 @@
       <w:r>
         <w:rPr>
           <w:sz w:val="22"/>
+          <w:rtl/>
+          <w:lang w:bidi="he-IL"/>
         </w:rPr>
         <w:t>8. לחיצת "שמור רשומה"</w:t>
       </w:r>
@@ -2650,6 +3484,10 @@
         <w:jc w:val="right"/>
       </w:pPr>
       <w:r>
+        <w:rPr>
+          <w:rtl/>
+          <w:lang w:bidi="he-IL"/>
+        </w:rPr>
         <w:t>7.2 הוספת מטפל חדש</w:t>
       </w:r>
     </w:p>
@@ -2663,6 +3501,8 @@
       <w:r>
         <w:rPr>
           <w:sz w:val="22"/>
+          <w:rtl/>
+          <w:lang w:bidi="he-IL"/>
         </w:rPr>
         <w:t>1. מנהל נכנס ל"משתמשים והרשאות"</w:t>
       </w:r>
@@ -2677,6 +3517,8 @@
       <w:r>
         <w:rPr>
           <w:sz w:val="22"/>
+          <w:rtl/>
+          <w:lang w:bidi="he-IL"/>
         </w:rPr>
         <w:t>2. הזנת כתובת מייל + תפקיד</w:t>
       </w:r>
@@ -2691,6 +3533,8 @@
       <w:r>
         <w:rPr>
           <w:sz w:val="22"/>
+          <w:rtl/>
+          <w:lang w:bidi="he-IL"/>
         </w:rPr>
         <w:t>3. מטפל מקבל מייל הזמנה</w:t>
       </w:r>
@@ -2705,6 +3549,8 @@
       <w:r>
         <w:rPr>
           <w:sz w:val="22"/>
+          <w:rtl/>
+          <w:lang w:bidi="he-IL"/>
         </w:rPr>
         <w:t>4. הזמנה מקשרת לכניסה עם גוגל</w:t>
       </w:r>
@@ -2719,6 +3565,8 @@
       <w:r>
         <w:rPr>
           <w:sz w:val="22"/>
+          <w:rtl/>
+          <w:lang w:bidi="he-IL"/>
         </w:rPr>
         <w:t>5. לאחר כניסה — חבר צוות פעיל</w:t>
       </w:r>
@@ -2730,6 +3578,10 @@
         <w:jc w:val="right"/>
       </w:pPr>
       <w:r>
+        <w:rPr>
+          <w:rtl/>
+          <w:lang w:bidi="he-IL"/>
+        </w:rPr>
         <w:t>7.3 שינוי תבנית תיעוד</w:t>
       </w:r>
     </w:p>
@@ -2743,6 +3595,8 @@
       <w:r>
         <w:rPr>
           <w:sz w:val="22"/>
+          <w:rtl/>
+          <w:lang w:bidi="he-IL"/>
         </w:rPr>
         <w:t>1. מנהל נכנס להגדרות → תבנית תיעוד</w:t>
       </w:r>
@@ -2757,8 +3611,10 @@
       <w:r>
         <w:rPr>
           <w:sz w:val="22"/>
+          <w:rtl/>
+          <w:lang w:bidi="he-IL"/>
         </w:rPr>
-        <w:t>2. בחירת תבנית מהרשימה (7 מובנות) או הדבקת דגימה</w:t>
+        <w:t>2. בחירת תחום מקצועי (פיזיותרפיה / קלינאות תקשורת / ריפוי בעיסוק וכו')</w:t>
       </w:r>
     </w:p>
     <w:p>
@@ -2771,8 +3627,10 @@
       <w:r>
         <w:rPr>
           <w:sz w:val="22"/>
+          <w:rtl/>
+          <w:lang w:bidi="he-IL"/>
         </w:rPr>
-        <w:t>3. לחיצת "בחר תבנית"</w:t>
+        <w:t>3. בחירת תבנית ספציפית מהקבוצה, או הדבקת דגימה לתבנית מותאמת</w:t>
       </w:r>
     </w:p>
     <w:p>
@@ -2785,8 +3643,26 @@
       <w:r>
         <w:rPr>
           <w:sz w:val="22"/>
+          <w:rtl/>
+          <w:lang w:bidi="he-IL"/>
         </w:rPr>
-        <w:t>4. כל התיעוד הבא (Scribe + טפסים ידניים) משתמש בתבנית החדשה</w:t>
+        <w:t>4. לחיצת "בחר תבנית"</w:t>
+      </w:r>
+    </w:p>
+    <w:p>
+      <w:pPr>
+        <w:pStyle w:val="ListBullet"/>
+        <w:bidi w:val="1"/>
+        <w:spacing w:after="60"/>
+        <w:jc w:val="right"/>
+      </w:pPr>
+      <w:r>
+        <w:rPr>
+          <w:sz w:val="22"/>
+          <w:rtl/>
+          <w:lang w:bidi="he-IL"/>
+        </w:rPr>
+        <w:t>5. כל התיעוד הבא (Scribe + טפסים ידניים) משתמש בתבנית החדשה</w:t>
       </w:r>
     </w:p>
     <w:p>
@@ -2808,6 +3684,10 @@
         <w:jc w:val="right"/>
       </w:pPr>
       <w:r>
+        <w:rPr>
+          <w:rtl/>
+          <w:lang w:bidi="he-IL"/>
+        </w:rPr>
         <w:t>8. אינטגרציות חיצוניות</w:t>
       </w:r>
     </w:p>
@@ -2817,6 +3697,7 @@
         <w:tblW w:type="auto" w:w="0"/>
         <w:jc w:val="center"/>
         <w:tblLook w:firstColumn="1" w:firstRow="1" w:lastColumn="0" w:lastRow="0" w:noHBand="0" w:noVBand="1" w:val="04A0"/>
+        <w:bidiVisual/>
       </w:tblPr>
       <w:tblGrid>
         <w:gridCol w:w="3024"/>
@@ -2830,11 +3711,16 @@
           </w:tcPr>
           <w:p>
             <w:pPr>
-              <w:jc w:val="center"/>
+              <w:jc w:val="right"/>
+              <w:bidi w:val="1"/>
             </w:pPr>
             <w:r>
               <w:rPr>
                 <w:b/>
+                <w:rtl/>
+                <w:lang w:bidi="he-IL"/>
+                <w:rtl/>
+                <w:lang w:bidi="he-IL"/>
               </w:rPr>
               <w:t>שירות</w:t>
             </w:r>
@@ -2846,11 +3732,16 @@
           </w:tcPr>
           <w:p>
             <w:pPr>
-              <w:jc w:val="center"/>
+              <w:jc w:val="right"/>
+              <w:bidi w:val="1"/>
             </w:pPr>
             <w:r>
               <w:rPr>
                 <w:b/>
+                <w:rtl/>
+                <w:lang w:bidi="he-IL"/>
+                <w:rtl/>
+                <w:lang w:bidi="he-IL"/>
               </w:rPr>
               <w:t>מטרה</w:t>
             </w:r>
@@ -2862,11 +3753,16 @@
           </w:tcPr>
           <w:p>
             <w:pPr>
-              <w:jc w:val="center"/>
+              <w:jc w:val="right"/>
+              <w:bidi w:val="1"/>
             </w:pPr>
             <w:r>
               <w:rPr>
                 <w:b/>
+                <w:rtl/>
+                <w:lang w:bidi="he-IL"/>
+                <w:rtl/>
+                <w:lang w:bidi="he-IL"/>
               </w:rPr>
               <w:t>מפתח סביבה</w:t>
             </w:r>
@@ -2881,8 +3777,15 @@
           <w:p>
             <w:pPr>
               <w:jc w:val="right"/>
+              <w:bidi w:val="1"/>
             </w:pPr>
             <w:r>
+              <w:rPr>
+                <w:rtl/>
+                <w:lang w:bidi="he-IL"/>
+                <w:rtl/>
+                <w:lang w:bidi="he-IL"/>
+              </w:rPr>
               <w:t>Supabase</w:t>
             </w:r>
           </w:p>
@@ -2894,8 +3797,15 @@
           <w:p>
             <w:pPr>
               <w:jc w:val="right"/>
+              <w:bidi w:val="1"/>
             </w:pPr>
             <w:r>
+              <w:rPr>
+                <w:rtl/>
+                <w:lang w:bidi="he-IL"/>
+                <w:rtl/>
+                <w:lang w:bidi="he-IL"/>
+              </w:rPr>
               <w:t>DB, Auth, Storage, RLS</w:t>
             </w:r>
           </w:p>
@@ -2907,8 +3817,15 @@
           <w:p>
             <w:pPr>
               <w:jc w:val="right"/>
+              <w:bidi w:val="1"/>
             </w:pPr>
             <w:r>
+              <w:rPr>
+                <w:rtl/>
+                <w:lang w:bidi="he-IL"/>
+                <w:rtl/>
+                <w:lang w:bidi="he-IL"/>
+              </w:rPr>
               <w:t>NEXT_PUBLIC_SUPABASE_URL / ANON_KEY / SERVICE_ROLE_KEY</w:t>
             </w:r>
           </w:p>
@@ -2922,8 +3839,15 @@
           <w:p>
             <w:pPr>
               <w:jc w:val="right"/>
+              <w:bidi w:val="1"/>
             </w:pPr>
             <w:r>
+              <w:rPr>
+                <w:rtl/>
+                <w:lang w:bidi="he-IL"/>
+                <w:rtl/>
+                <w:lang w:bidi="he-IL"/>
+              </w:rPr>
               <w:t>Deepgram</w:t>
             </w:r>
           </w:p>
@@ -2935,8 +3859,15 @@
           <w:p>
             <w:pPr>
               <w:jc w:val="right"/>
+              <w:bidi w:val="1"/>
             </w:pPr>
             <w:r>
+              <w:rPr>
+                <w:rtl/>
+                <w:lang w:bidi="he-IL"/>
+                <w:rtl/>
+                <w:lang w:bidi="he-IL"/>
+              </w:rPr>
               <w:t>תמלול קולי בעברית</w:t>
             </w:r>
           </w:p>
@@ -2948,8 +3879,15 @@
           <w:p>
             <w:pPr>
               <w:jc w:val="right"/>
+              <w:bidi w:val="1"/>
             </w:pPr>
             <w:r>
+              <w:rPr>
+                <w:rtl/>
+                <w:lang w:bidi="he-IL"/>
+                <w:rtl/>
+                <w:lang w:bidi="he-IL"/>
+              </w:rPr>
               <w:t>DG_KEY</w:t>
             </w:r>
           </w:p>
@@ -2963,8 +3901,15 @@
           <w:p>
             <w:pPr>
               <w:jc w:val="right"/>
+              <w:bidi w:val="1"/>
             </w:pPr>
             <w:r>
+              <w:rPr>
+                <w:rtl/>
+                <w:lang w:bidi="he-IL"/>
+                <w:rtl/>
+                <w:lang w:bidi="he-IL"/>
+              </w:rPr>
               <w:t>Anthropic</w:t>
             </w:r>
           </w:p>
@@ -2976,8 +3921,15 @@
           <w:p>
             <w:pPr>
               <w:jc w:val="right"/>
+              <w:bidi w:val="1"/>
             </w:pPr>
             <w:r>
+              <w:rPr>
+                <w:rtl/>
+                <w:lang w:bidi="he-IL"/>
+                <w:rtl/>
+                <w:lang w:bidi="he-IL"/>
+              </w:rPr>
               <w:t>יצירת רשומות ומסמכים</w:t>
             </w:r>
           </w:p>
@@ -2989,8 +3941,15 @@
           <w:p>
             <w:pPr>
               <w:jc w:val="right"/>
+              <w:bidi w:val="1"/>
             </w:pPr>
             <w:r>
+              <w:rPr>
+                <w:rtl/>
+                <w:lang w:bidi="he-IL"/>
+                <w:rtl/>
+                <w:lang w:bidi="he-IL"/>
+              </w:rPr>
               <w:t>CL_KEY</w:t>
             </w:r>
           </w:p>
@@ -3004,8 +3963,15 @@
           <w:p>
             <w:pPr>
               <w:jc w:val="right"/>
+              <w:bidi w:val="1"/>
             </w:pPr>
             <w:r>
+              <w:rPr>
+                <w:rtl/>
+                <w:lang w:bidi="he-IL"/>
+                <w:rtl/>
+                <w:lang w:bidi="he-IL"/>
+              </w:rPr>
               <w:t>Google OAuth</w:t>
             </w:r>
           </w:p>
@@ -3017,8 +3983,15 @@
           <w:p>
             <w:pPr>
               <w:jc w:val="right"/>
+              <w:bidi w:val="1"/>
             </w:pPr>
             <w:r>
+              <w:rPr>
+                <w:rtl/>
+                <w:lang w:bidi="he-IL"/>
+                <w:rtl/>
+                <w:lang w:bidi="he-IL"/>
+              </w:rPr>
               <w:t>כניסת משתמשים</w:t>
             </w:r>
           </w:p>
@@ -3030,8 +4003,15 @@
           <w:p>
             <w:pPr>
               <w:jc w:val="right"/>
+              <w:bidi w:val="1"/>
             </w:pPr>
             <w:r>
+              <w:rPr>
+                <w:rtl/>
+                <w:lang w:bidi="he-IL"/>
+                <w:rtl/>
+                <w:lang w:bidi="he-IL"/>
+              </w:rPr>
               <w:t>מוגדר ב-Supabase Auth</w:t>
             </w:r>
           </w:p>
@@ -3058,6 +4038,10 @@
         <w:jc w:val="right"/>
       </w:pPr>
       <w:r>
+        <w:rPr>
+          <w:rtl/>
+          <w:lang w:bidi="he-IL"/>
+        </w:rPr>
         <w:t>9. שאלות פתוחות לדיון</w:t>
       </w:r>
     </w:p>
@@ -3071,12 +4055,16 @@
         <w:rPr>
           <w:b/>
           <w:sz w:val="22"/>
+          <w:rtl/>
+          <w:lang w:bidi="he-IL"/>
         </w:rPr>
         <w:t xml:space="preserve">❓ מודל עסקי: </w:t>
       </w:r>
       <w:r>
         <w:rPr>
           <w:sz w:val="22"/>
+          <w:rtl/>
+          <w:lang w:bidi="he-IL"/>
         </w:rPr>
         <w:t>מנוי חודשי פר מטפל? פר קליניקה? Freemium? מה תמחור ראשוני?</w:t>
       </w:r>
@@ -3091,12 +4079,16 @@
         <w:rPr>
           <w:b/>
           <w:sz w:val="22"/>
+          <w:rtl/>
+          <w:lang w:bidi="he-IL"/>
         </w:rPr>
         <w:t xml:space="preserve">❓ מובייל: </w:t>
       </w:r>
       <w:r>
         <w:rPr>
           <w:sz w:val="22"/>
+          <w:rtl/>
+          <w:lang w:bidi="he-IL"/>
         </w:rPr>
         <w:t>האם ל-PWA מספיק? iOS/Android native? מתי?</w:t>
       </w:r>
@@ -3111,12 +4103,16 @@
         <w:rPr>
           <w:b/>
           <w:sz w:val="22"/>
+          <w:rtl/>
+          <w:lang w:bidi="he-IL"/>
         </w:rPr>
         <w:t xml:space="preserve">❓ HIPAA / GDPR: </w:t>
       </w:r>
       <w:r>
         <w:rPr>
           <w:sz w:val="22"/>
+          <w:rtl/>
+          <w:lang w:bidi="he-IL"/>
         </w:rPr>
         <w:t>מה רמת ציות הנדרשת? האם נדרש Data Processing Agreement עם Supabase/Anthropic/Deepgram?</w:t>
       </w:r>
@@ -3131,12 +4127,16 @@
         <w:rPr>
           <w:b/>
           <w:sz w:val="22"/>
+          <w:rtl/>
+          <w:lang w:bidi="he-IL"/>
         </w:rPr>
         <w:t xml:space="preserve">❓ שפות נוספות: </w:t>
       </w:r>
       <w:r>
         <w:rPr>
           <w:sz w:val="22"/>
+          <w:rtl/>
+          <w:lang w:bidi="he-IL"/>
         </w:rPr>
         <w:t>האם לתמוך בערבית? אנגלית? לאיזה שוק מכוונים בשנה 2?</w:t>
       </w:r>
@@ -3151,12 +4151,16 @@
         <w:rPr>
           <w:b/>
           <w:sz w:val="22"/>
+          <w:rtl/>
+          <w:lang w:bidi="he-IL"/>
         </w:rPr>
         <w:t xml:space="preserve">❓ אינטגרציה עם EMR: </w:t>
       </w:r>
       <w:r>
         <w:rPr>
           <w:sz w:val="22"/>
+          <w:rtl/>
+          <w:lang w:bidi="he-IL"/>
         </w:rPr>
         <w:t>כלומדית? מירב? Clalit HIS? מה הדחיפות?</w:t>
       </w:r>
@@ -3171,12 +4175,16 @@
         <w:rPr>
           <w:b/>
           <w:sz w:val="22"/>
+          <w:rtl/>
+          <w:lang w:bidi="he-IL"/>
         </w:rPr>
         <w:t xml:space="preserve">❓ חתימה ואישור רשומה: </w:t>
       </w:r>
       <w:r>
         <w:rPr>
           <w:sz w:val="22"/>
+          <w:rtl/>
+          <w:lang w:bidi="he-IL"/>
         </w:rPr>
         <w:t>האם נדרש workflow "רופא מאשר" לצורך ביטוח לאומי?</w:t>
       </w:r>
@@ -3191,12 +4199,16 @@
         <w:rPr>
           <w:b/>
           <w:sz w:val="22"/>
+          <w:rtl/>
+          <w:lang w:bidi="he-IL"/>
         </w:rPr>
         <w:t xml:space="preserve">❓ Offline: </w:t>
       </w:r>
       <w:r>
         <w:rPr>
           <w:sz w:val="22"/>
+          <w:rtl/>
+          <w:lang w:bidi="he-IL"/>
         </w:rPr>
         <w:t>האם נדרש תמיכה ללא אינטרנט (אזורים כפריים, מרפאות שדה)?</w:t>
       </w:r>
@@ -3211,14 +4223,42 @@
         <w:rPr>
           <w:b/>
           <w:sz w:val="22"/>
+          <w:rtl/>
+          <w:lang w:bidi="he-IL"/>
         </w:rPr>
         <w:t xml:space="preserve">❓ Export / Backup: </w:t>
       </w:r>
       <w:r>
         <w:rPr>
           <w:sz w:val="22"/>
+          <w:rtl/>
+          <w:lang w:bidi="he-IL"/>
         </w:rPr>
         <w:t>ייצוא נתונים לקליניקה עצמה? PDF אוטומטי?</w:t>
+      </w:r>
+    </w:p>
+    <w:p>
+      <w:pPr>
+        <w:bidi w:val="1"/>
+        <w:spacing w:before="80" w:after="40"/>
+        <w:jc w:val="right"/>
+      </w:pPr>
+      <w:r>
+        <w:rPr>
+          <w:b/>
+          <w:sz w:val="22"/>
+          <w:rtl/>
+          <w:lang w:bidi="he-IL"/>
+        </w:rPr>
+        <w:t xml:space="preserve">❓ הרחבת תחומים: </w:t>
+      </w:r>
+      <w:r>
+        <w:rPr>
+          <w:sz w:val="22"/>
+          <w:rtl/>
+          <w:lang w:bidi="he-IL"/>
+        </w:rPr>
+        <w:t>אופטומטריה, כירורגיה שיניים, עיסוי רפואי — מתי ואיך?</w:t>
       </w:r>
     </w:p>
     <w:p>
@@ -3240,6 +4280,10 @@
         <w:jc w:val="right"/>
       </w:pPr>
       <w:r>
+        <w:rPr>
+          <w:rtl/>
+          <w:lang w:bidi="he-IL"/>
+        </w:rPr>
         <w:t>10. מדדי הצלחה (KPIs)</w:t>
       </w:r>
     </w:p>
@@ -3253,6 +4297,8 @@
       <w:r>
         <w:rPr>
           <w:sz w:val="22"/>
+          <w:rtl/>
+          <w:lang w:bidi="he-IL"/>
         </w:rPr>
         <w:t>זמן תיעוד ממוצע לטיפול &lt; 2 דקות (כולל עריכה)</w:t>
       </w:r>
@@ -3267,6 +4313,8 @@
       <w:r>
         <w:rPr>
           <w:sz w:val="22"/>
+          <w:rtl/>
+          <w:lang w:bidi="he-IL"/>
         </w:rPr>
         <w:t>שביעות רצון מטפלים ≥ 4.5/5</w:t>
       </w:r>
@@ -3281,6 +4329,8 @@
       <w:r>
         <w:rPr>
           <w:sz w:val="22"/>
+          <w:rtl/>
+          <w:lang w:bidi="he-IL"/>
         </w:rPr>
         <w:t>דיוק תמלול עברית &gt; 90%</w:t>
       </w:r>
@@ -3295,6 +4345,8 @@
       <w:r>
         <w:rPr>
           <w:sz w:val="22"/>
+          <w:rtl/>
+          <w:lang w:bidi="he-IL"/>
         </w:rPr>
         <w:t>אחוז ניסויי Scribe שהסתיימו בשמירה &gt; 80%</w:t>
       </w:r>
@@ -3309,6 +4361,8 @@
       <w:r>
         <w:rPr>
           <w:sz w:val="22"/>
+          <w:rtl/>
+          <w:lang w:bidi="he-IL"/>
         </w:rPr>
         <w:t>Churn חודשי &lt; 5%</w:t>
       </w:r>
@@ -3323,6 +4377,8 @@
       <w:r>
         <w:rPr>
           <w:sz w:val="22"/>
+          <w:rtl/>
+          <w:lang w:bidi="he-IL"/>
         </w:rPr>
         <w:t>זמן קליטה (Onboarding) ≤ 10 דקות לקליניקה חדשה</w:t>
       </w:r>
@@ -3349,6 +4405,8 @@
           <w:i/>
           <w:color w:val="94A3B8"/>
           <w:sz w:val="18"/>
+          <w:rtl/>
+          <w:lang w:bidi="he-IL"/>
         </w:rPr>
         <w:t>praxisAI · מסמך פנימי לשיתוף צוות בלבד · יוני 2026</w:t>
       </w:r>

</xml_diff>